<commit_message>
Pre-submission revisions: abstract+intro rewrites; figure paths; password scrub; doc cleanup
- Apply Thesis-A-led abstract rewrite with 91.4%/92.5% reconciliation
- Apply Intro paragraph 4 demotion (1 primary + 3 secondaries)
- Fix broken figure paths in supplementary materials (now repo-relative)
- Replace hardcoded DB password with environment variable lookup in 6 scripts
- Add .env.example template
- Remove plaintext Postgres pw.txt files
- Move stale drafts (3, 4, 5) to docs/archive/
- Add reviewer response document, Zenodo tutorial, abstract proposal
- Add S11 (Scope of Generalization) and S12 (478-cluster BLAST) supplementary tables
- Regenerate Word docs

Co-Authored-By: Claude Opus 4.7 (1M context) <noreply@anthropic.com>
</commit_message>
<xml_diff>
--- a/docs/Pandoravirus_combo_paper_draft6_GBE.docx
+++ b/docs/Pandoravirus_combo_paper_draft6_GBE.docx
@@ -2,7 +2,7 @@
 <file path=word/document.xml><?xml version="1.0" encoding="utf-8"?>
 <w:document xmlns:w="http://schemas.openxmlformats.org/wordprocessingml/2006/main" xmlns:m="http://schemas.openxmlformats.org/officeDocument/2006/math" xmlns:r="http://schemas.openxmlformats.org/officeDocument/2006/relationships" xmlns:o="urn:schemas-microsoft-com:office:office" xmlns:v="urn:schemas-microsoft-com:vml" xmlns:w10="urn:schemas-microsoft-com:office:word" xmlns:a="http://schemas.openxmlformats.org/drawingml/2006/main" xmlns:pic="http://schemas.openxmlformats.org/drawingml/2006/picture" xmlns:wp="http://schemas.openxmlformats.org/drawingml/2006/wordprocessingDrawing">
   <w:body>
-    <w:bookmarkStart w:id="39" w:name="Xf8e458a4fb7c87023bae87e1e943a21fb20e430"/>
+    <w:bookmarkStart w:id="40" w:name="Xf8e458a4fb7c87023bae87e1e943a21fb20e430"/>
     <w:p>
       <w:pPr>
         <w:pStyle w:val="Heading1"/>
@@ -62,6 +62,12 @@
         <w:pStyle w:val="FirstParagraph"/>
       </w:pPr>
       <w:r>
+        <w:t xml:space="preserve">How do new genes arise in regions of the genome distant from existing regulatory elements?</w:t>
+      </w:r>
+      <w:r>
+        <w:t xml:space="preserve"> </w:t>
+      </w:r>
+      <w:r>
         <w:rPr>
           <w:i/>
           <w:iCs/>
@@ -72,7 +78,15 @@
         <w:t xml:space="preserve"> </w:t>
       </w:r>
       <w:r>
-        <w:t xml:space="preserve">possesses the largest known viral genome (2.47 Mb) with an unprecedented 92.5% of genes classified as ORFans, proteins with no detectable homologs outside the Pandoraviridae (Philippe et al. 2013). While de novo gene creation from non-coding sequence has been proposed as the primary diversifying mechanism of this lineage, the genomic infrastructure enabling this process remains poorly understood. Here we present a 12-module computational framework combining compositional analysis, structural prediction, transcriptomic validation, and genome-wide homology analysis to characterize the mechanism underlying de novo gene birth in</w:t>
+        <w:t xml:space="preserve">possesses the largest known viral genome (2.47 Mb), with an estimated 91.4% of proteins lacking detectable homologs outside the Pandoraviridae (95% CI: 89.6%–93.0%; consistent with the 92.5% reported by Philippe et al. 2013), but the infrastructure enabling such pervasive de novo gene birth has remained unclear.</w:t>
+      </w:r>
+    </w:p>
+    <w:p>
+      <w:pPr>
+        <w:pStyle w:val="BodyText"/>
+      </w:pPr>
+      <w:r>
+        <w:t xml:space="preserve">Here we identify a distributed AT-based regulatory system that pre-loads intergenic space with promoter and terminator signals throughout</w:t>
       </w:r>
       <w:r>
         <w:t xml:space="preserve"> </w:t>
@@ -85,148 +99,39 @@
         <w:t xml:space="preserve">P. salinus</w:t>
       </w:r>
       <w:r>
-        <w:t xml:space="preserve">, with comparative validation across four additional Nucleocytoviricota spanning four families and GC contents from 28% to 64%.</w:t>
-      </w:r>
-    </w:p>
-    <w:p>
-      <w:pPr>
-        <w:pStyle w:val="BodyText"/>
-      </w:pPr>
-      <w:r>
-        <w:t xml:space="preserve">We identify a five-tier proto-gene continuum exhibiting a monotonic gradient from established genes (mean GC 0.650, 1,452 bp) through proto-genes approaching intergenic composition (GC 0.547, 216 bp), with codon optimization detectable even in the most immature candidates (p = 0.0005). Critically, we discover that poly-A/T regulatory signals, functioning as promoters and terminators, pre-exist throughout intergenic space, with proto-genes exhibiting mature regulatory signatures indistinguishable from established genes (p = 0.14). This distributed AT-based regulatory system produces the strongest gene boundary signals observed across all tested genomes (+10.3 and +9.8 percentage points AT enrichment at gene starts and ends, respectively), despite operating against the genome’s 62% GC composition.</w:t>
-      </w:r>
-    </w:p>
-    <w:p>
-      <w:pPr>
-        <w:pStyle w:val="BodyText"/>
-      </w:pPr>
-      <w:r>
-        <w:t xml:space="preserve">Strand-aware analysis of poly-A/T positioning relative to experimentally informed gene annotations confirms that 74% of boundary-associated runs occupy the correct regulatory position (binomial p &lt; 10⁻⁶). BLASTp analysis reveals that 81.8% of annotated genes and 97.0% of hypothetical genes are Pandoravirus-specific orphans, with annotated genes 7.2-fold more likely to retain external homologs than hypothetical genes (Fisher’s exact test, OR = 7.19, 95% CI: 3.5–13.6, p = 7.79 × 10⁻¹²), a gradient that is robust across E-value thresholds (81.8%–90.4% from 10⁻⁵ to 10⁻⁵⁰).</w:t>
-      </w:r>
-    </w:p>
-    <w:p>
-      <w:pPr>
-        <w:pStyle w:val="BodyText"/>
-      </w:pPr>
-      <w:r>
-        <w:t xml:space="preserve">Using an adaptive GC-normalized gene family detection method that corrects for base-composition bias in k-mer frequency space, we find that 64.1% of</w:t>
-      </w:r>
-      <w:r>
-        <w:t xml:space="preserve"> </w:t>
-      </w:r>
-      <w:r>
-        <w:rPr>
-          <w:i/>
-          <w:iCs/>
-        </w:rPr>
-        <w:t xml:space="preserve">P. salinus</w:t>
-      </w:r>
-      <w:r>
-        <w:t xml:space="preserve"> </w:t>
-      </w:r>
-      <w:r>
-        <w:t xml:space="preserve">genes are compositional singletons, consistent with de novo gene creation as the dominant growth mechanism. Comparative analysis across five NCLDVs demonstrates that several</w:t>
-      </w:r>
-      <w:r>
-        <w:t xml:space="preserve"> </w:t>
-      </w:r>
-      <w:r>
-        <w:rPr>
-          <w:i/>
-          <w:iCs/>
-        </w:rPr>
-        <w:t xml:space="preserve">P. salinus</w:t>
-      </w:r>
-      <w:r>
-        <w:t xml:space="preserve"> </w:t>
-      </w:r>
-      <w:r>
-        <w:t xml:space="preserve">patterns are broadly conserved: near-perfect strand balance in four of five genomes (48.8–51.3% plus-strand), translational selection toward host codon usage, and singleton-dominated proteomes. The direction of codon maturation, confirmed by formal Mann-Whitney U tests (GC3 and CAI shifts significant in all five genomes, all p &lt; 0.05), reverses in AT-rich Mimivirus (28% GC), consistent with the de novo birth model across compositionally diverse genomes.</w:t>
-      </w:r>
-      <w:r>
-        <w:t xml:space="preserve"> </w:t>
-      </w:r>
-      <w:r>
-        <w:rPr>
-          <w:i/>
-          <w:iCs/>
-        </w:rPr>
-        <w:t xml:space="preserve">Pandoravirus dulcis</w:t>
-      </w:r>
-      <w:r>
-        <w:t xml:space="preserve"> </w:t>
-      </w:r>
-      <w:r>
-        <w:t xml:space="preserve">provides independent same-genus replication of the key</w:t>
-      </w:r>
-      <w:r>
-        <w:t xml:space="preserve"> </w:t>
-      </w:r>
-      <w:r>
-        <w:rPr>
-          <w:i/>
-          <w:iCs/>
-        </w:rPr>
-        <w:t xml:space="preserve">P. salinus</w:t>
-      </w:r>
-      <w:r>
-        <w:t xml:space="preserve"> </w:t>
-      </w:r>
-      <w:r>
-        <w:t xml:space="preserve">findings, and the AGCT tetranucleotide ranks as the single most depleted of all 256 4-mers (rank 1/256) in both Pandoravirus species and in</w:t>
-      </w:r>
-      <w:r>
-        <w:t xml:space="preserve"> </w:t>
-      </w:r>
-      <w:r>
-        <w:rPr>
-          <w:i/>
-          <w:iCs/>
-        </w:rPr>
-        <w:t xml:space="preserve">Mollivirus</w:t>
-      </w:r>
-      <w:r>
-        <w:t xml:space="preserve">, while enriched in</w:t>
-      </w:r>
-      <w:r>
-        <w:t xml:space="preserve"> </w:t>
-      </w:r>
-      <w:r>
-        <w:rPr>
-          <w:i/>
-          <w:iCs/>
-        </w:rPr>
-        <w:t xml:space="preserve">Mimivirus</w:t>
-      </w:r>
-      <w:r>
-        <w:t xml:space="preserve"> </w:t>
-      </w:r>
-      <w:r>
-        <w:t xml:space="preserve">(rank 241/256) and</w:t>
-      </w:r>
-      <w:r>
-        <w:t xml:space="preserve"> </w:t>
-      </w:r>
-      <w:r>
-        <w:rPr>
-          <w:i/>
-          <w:iCs/>
-        </w:rPr>
-        <w:t xml:space="preserve">Pithovirus</w:t>
-      </w:r>
-      <w:r>
-        <w:t xml:space="preserve"> </w:t>
-      </w:r>
-      <w:r>
-        <w:t xml:space="preserve">(rank 185/256), implicating a lineage-specific sequence constraint in the Pandoraviridae.</w:t>
-      </w:r>
-    </w:p>
-    <w:p>
-      <w:pPr>
-        <w:pStyle w:val="BodyText"/>
-      </w:pPr>
-      <w:r>
-        <w:t xml:space="preserve">These findings establish a four-stage maturation model, regulatory signals (pre-existing) → protein structure → codon optimization → GC composition, providing independent computational confirmation of the de novo gene birth hypothesis via a fundamentally different methodology than the Claverie group’s comparative genomic approach.</w:t>
+        <w:t xml:space="preserve">. Meta-gene profiles reveal AT enrichment of +10.3 / +9.8 percentage points at gene starts and ends, the strongest boundary signals among five giant viruses tested, and unexpected given the genome’s 62% GC composition. Strand-aware analysis confirms that 74.0% of boundary-associated runs occupy the correct regulatory orientation (3,559/4,810; two-sided binomial p ≈ 8 × 10⁻²⁵³), with same-genus replication in</w:t>
+      </w:r>
+      <w:r>
+        <w:t xml:space="preserve"> </w:t>
+      </w:r>
+      <w:r>
+        <w:rPr>
+          <w:i/>
+          <w:iCs/>
+        </w:rPr>
+        <w:t xml:space="preserve">P. dulcis</w:t>
+      </w:r>
+      <w:r>
+        <w:t xml:space="preserve"> </w:t>
+      </w:r>
+      <w:r>
+        <w:t xml:space="preserve">(61.8%; 3,956/6,403; p ≈ 6 × 10⁻⁸⁰). Boundary-proximal and dispersed intergenic runs are compositionally identical (Cohen’s d &lt; 0.05), indicating a uniform regulatory substrate rather than concentrated hotspots.</w:t>
+      </w:r>
+    </w:p>
+    <w:p>
+      <w:pPr>
+        <w:pStyle w:val="BodyText"/>
+      </w:pPr>
+      <w:r>
+        <w:t xml:space="preserve">This architecture supports a four-stage maturation model: regulatory signals (pre-existing) → protein structure → codon optimization → GC composition. A five-tier proto-gene continuum exhibits monotonic gradients across all measured features; codon usage is shifted toward genome-preferred patterns even in the most immature candidates (p = 0.0005); and external homologs are 7.2-fold enriched in older annotated genes versus younger hypothetical genes (Fisher’s exact test, OR = 7.19, p = 7.79 × 10⁻¹²). Comparative analysis across four additional Nucleocytoviricota (28%–64% GC, four families) confirms singleton-dominated proteomes (64%–91% under adaptive thresholds), translational selection toward host codon usage, and Pandoraviridae-specific extreme AGCT depletion (rank 1/256 in both Pandoravirus species).</w:t>
+      </w:r>
+    </w:p>
+    <w:p>
+      <w:pPr>
+        <w:pStyle w:val="BodyText"/>
+      </w:pPr>
+      <w:r>
+        <w:t xml:space="preserve">These findings provide independent computational confirmation of the de novo gene birth model, arrived at through a fundamentally different methodology than the Claverie group’s comparative genomics approach.</w:t>
       </w:r>
     </w:p>
     <w:p>
@@ -331,6 +236,14 @@
         <w:pStyle w:val="BodyText"/>
       </w:pPr>
       <w:r>
+        <w:t xml:space="preserve">The broader de novo gene birth literature establishes that protein-coding genes can originate from previously non-coding sequence in a wide range of organisms, with reviews (Schlötterer 2015; Van Oss and Carvunis 2019) describing both proto-gene continuum and ORF-first frameworks for the process. Empirical work in yeast and other model systems has shown that young genes are structurally distinct from random ORFs (Wilson et al. 2017) and that thymine-rich non-coding sequence can serve as a reservoir for adaptive transmembrane peptides (Vakirlis et al. 2020). Pandoravirus, with the largest known viral genome and the most extreme reported ORFan fraction in any genome, offers an unusually high signal-to-noise system for testing mechanistic hypotheses about how de novo gene birth proceeds at scale.</w:t>
+      </w:r>
+    </w:p>
+    <w:p>
+      <w:pPr>
+        <w:pStyle w:val="BodyText"/>
+      </w:pPr>
+      <w:r>
         <w:t xml:space="preserve">The Claverie group has provided compelling evidence that de novo gene creation from non-coding sequence is the primary diversifying mechanism of the Pandoraviridae. Legendre et al. (2018) conducted strand-specific RNA-seq across four Pandoravirus strains, demonstrating that 83–87% of genome sequence is transcribed, that palindromic hairpin structures mark approximately 70% of transcript 3’ ends, and that the Pandoravirus pangenome is open, each new strain adds roughly 60 previously unseen proteins. Jeudy et al. (2019) provided direct evidence by comparing the nearly identical genomes of</w:t>
       </w:r>
       <w:r>
@@ -445,7 +358,75 @@
         <w:pStyle w:val="BodyText"/>
       </w:pPr>
       <w:r>
-        <w:t xml:space="preserve">Here we present a multi-method computational framework that addresses the mechanistic gap. Through a 12-module analytical pipeline encompassing genome architecture, null model calibration, codon usage analysis, gene prediction validation, evolutionary classification, gene family detection, protein structure prediction, regulatory signal discovery, transcriptomic validation, and genome-wide homology analysis, we provide four novel contributions. First, we establish that</w:t>
+        <w:t xml:space="preserve">Here we present a single-genome computational framework that addresses this mechanistic gap. We identify a</w:t>
+      </w:r>
+      <w:r>
+        <w:t xml:space="preserve"> </w:t>
+      </w:r>
+      <w:r>
+        <w:rPr>
+          <w:b/>
+          <w:bCs/>
+        </w:rPr>
+        <w:t xml:space="preserve">distributed AT-based regulatory system</w:t>
+      </w:r>
+      <w:r>
+        <w:t xml:space="preserve"> </w:t>
+      </w:r>
+      <w:r>
+        <w:t xml:space="preserve">that pre-loads intergenic regions with promoter and terminator signals, resolving how genes can arise far from existing regulatory elements. Three additional analyses anchor and contextualize this finding: (i) a quantitative five-tier proto-gene continuum with monotonic gradients across all measured features, providing a maturation metric for gene birth; (ii) an asymmetric four-stage maturation ordering — regulatory signals (pre-existing) → protein structure → codon optimization → GC composition — defining the temporal sequence of de novo gene birth; and (iii) cross-lineage validation across four additional Nucleocytoviricota (</w:t>
+      </w:r>
+      <w:r>
+        <w:rPr>
+          <w:i/>
+          <w:iCs/>
+        </w:rPr>
+        <w:t xml:space="preserve">Pandoravirus dulcis</w:t>
+      </w:r>
+      <w:r>
+        <w:t xml:space="preserve">,</w:t>
+      </w:r>
+      <w:r>
+        <w:t xml:space="preserve"> </w:t>
+      </w:r>
+      <w:r>
+        <w:rPr>
+          <w:i/>
+          <w:iCs/>
+        </w:rPr>
+        <w:t xml:space="preserve">Acanthamoeba polyphaga</w:t>
+      </w:r>
+      <w:r>
+        <w:t xml:space="preserve"> </w:t>
+      </w:r>
+      <w:r>
+        <w:t xml:space="preserve">mimivirus,</w:t>
+      </w:r>
+      <w:r>
+        <w:t xml:space="preserve"> </w:t>
+      </w:r>
+      <w:r>
+        <w:rPr>
+          <w:i/>
+          <w:iCs/>
+        </w:rPr>
+        <w:t xml:space="preserve">Pithovirus sibericum</w:t>
+      </w:r>
+      <w:r>
+        <w:t xml:space="preserve">,</w:t>
+      </w:r>
+      <w:r>
+        <w:t xml:space="preserve"> </w:t>
+      </w:r>
+      <w:r>
+        <w:rPr>
+          <w:i/>
+          <w:iCs/>
+        </w:rPr>
+        <w:t xml:space="preserve">Mollivirus sibericum</w:t>
+      </w:r>
+      <w:r>
+        <w:t xml:space="preserve">) spanning four families and 28%–64% GC content. Our approach differs fundamentally from the Claverie group’s multi-strain comparative genomics: all mechanistic findings derive from single-genome computational analysis of</w:t>
       </w:r>
       <w:r>
         <w:t xml:space="preserve"> </w:t>
@@ -458,110 +439,7 @@
         <w:t xml:space="preserve">P. salinus</w:t>
       </w:r>
       <w:r>
-        <w:t xml:space="preserve"> </w:t>
-      </w:r>
-      <w:r>
-        <w:t xml:space="preserve">is compositionally highly uniform despite being the largest genome tested, with ORFan genes indistinguishable from annotated genes by every codon metric applied, arguing against recent patchwork horizontal gene transfer. Second, we identify a quantitative five-tier proto-gene continuum with monotonic gradients across all measured features, supported by an adaptive-threshold gene family analysis and protein structure prediction, providing a maturation metric for gene birth. Third, we discover a distributed AT-based regulatory system that pre-loads intergenic regions with promoter and terminator signals, resolving the mechanistic gap of how genes arise far from existing regulatory elements. Fourth, we establish an asymmetric maturation ordering, regulatory signals pre-exist, followed by structural features, codon optimization, and finally GC composition, that defines the temporal sequence of de novo gene birth.</w:t>
-      </w:r>
-    </w:p>
-    <w:p>
-      <w:pPr>
-        <w:pStyle w:val="BodyText"/>
-      </w:pPr>
-      <w:r>
-        <w:t xml:space="preserve">Comparative analysis of four additional NCLDV genomes (</w:t>
-      </w:r>
-      <w:r>
-        <w:rPr>
-          <w:i/>
-          <w:iCs/>
-        </w:rPr>
-        <w:t xml:space="preserve">Pandoravirus dulcis</w:t>
-      </w:r>
-      <w:r>
-        <w:t xml:space="preserve">,</w:t>
-      </w:r>
-      <w:r>
-        <w:t xml:space="preserve"> </w:t>
-      </w:r>
-      <w:r>
-        <w:rPr>
-          <w:i/>
-          <w:iCs/>
-        </w:rPr>
-        <w:t xml:space="preserve">Acanthamoeba polyphaga</w:t>
-      </w:r>
-      <w:r>
-        <w:t xml:space="preserve"> </w:t>
-      </w:r>
-      <w:r>
-        <w:t xml:space="preserve">mimivirus,</w:t>
-      </w:r>
-      <w:r>
-        <w:t xml:space="preserve"> </w:t>
-      </w:r>
-      <w:r>
-        <w:rPr>
-          <w:i/>
-          <w:iCs/>
-        </w:rPr>
-        <w:t xml:space="preserve">Pithovirus sibericum</w:t>
-      </w:r>
-      <w:r>
-        <w:t xml:space="preserve">, and</w:t>
-      </w:r>
-      <w:r>
-        <w:t xml:space="preserve"> </w:t>
-      </w:r>
-      <w:r>
-        <w:rPr>
-          <w:i/>
-          <w:iCs/>
-        </w:rPr>
-        <w:t xml:space="preserve">Mollivirus sibericum</w:t>
-      </w:r>
-      <w:r>
-        <w:t xml:space="preserve">) provides cross-lineage context, confirming which</w:t>
-      </w:r>
-      <w:r>
-        <w:t xml:space="preserve"> </w:t>
-      </w:r>
-      <w:r>
-        <w:rPr>
-          <w:i/>
-          <w:iCs/>
-        </w:rPr>
-        <w:t xml:space="preserve">P. salinus</w:t>
-      </w:r>
-      <w:r>
-        <w:t xml:space="preserve"> </w:t>
-      </w:r>
-      <w:r>
-        <w:t xml:space="preserve">findings are broadly conserved across the Nucleocytoviricota and which are lineage-specific to the Pandoraviridae.</w:t>
-      </w:r>
-    </w:p>
-    <w:p>
-      <w:pPr>
-        <w:pStyle w:val="BodyText"/>
-      </w:pPr>
-      <w:r>
-        <w:t xml:space="preserve">Our approach differs fundamentally from previous work: all mechanistic findings derive from single-genome computational analysis of</w:t>
-      </w:r>
-      <w:r>
-        <w:t xml:space="preserve"> </w:t>
-      </w:r>
-      <w:r>
-        <w:rPr>
-          <w:i/>
-          <w:iCs/>
-        </w:rPr>
-        <w:t xml:space="preserve">P. salinus</w:t>
-      </w:r>
-      <w:r>
-        <w:t xml:space="preserve"> </w:t>
-      </w:r>
-      <w:r>
-        <w:t xml:space="preserve">without requiring multi-strain comparison, providing an independent line of evidence that complements the comparative genomics approach of the Claverie group.</w:t>
+        <w:t xml:space="preserve">, providing an independent line of evidence that converges on the same de novo gene birth model.</w:t>
       </w:r>
     </w:p>
     <w:p>
@@ -579,6 +457,14 @@
       </w:pPr>
       <w:r>
         <w:t xml:space="preserve">Results</w:t>
+      </w:r>
+    </w:p>
+    <w:p>
+      <w:pPr>
+        <w:pStyle w:val="FirstParagraph"/>
+      </w:pPr>
+      <w:r>
+        <w:t xml:space="preserve">The Results below build sequentially toward the central mechanistic finding: from the genome-wide compositional landscape, through the proto-gene continuum and the BLASTp-supported homology gradient, to the distributed AT regulatory system that resolves the mechanistic gap, and finally to cross-NCLDV validation. Each section provides one of multiple convergent lines of evidence supporting the de novo gene birth model.</w:t>
       </w:r>
     </w:p>
     <w:bookmarkStart w:id="12" w:name="genome-wide-compositional-landscape"/>
@@ -1337,7 +1223,7 @@
         <w:t xml:space="preserve">P. salinus</w:t>
       </w:r>
       <w:r>
-        <w:t xml:space="preserve">, encompassing 36% of genes; the remaining 64.1% are compositional singletons with no detectable similar partners. Of the 12 groups, the most biologically interpretable are small families of repeat-domain proteins (Fascin-like: 12 members; ankyrin: 8, 4, and 2 members) with no tandem clustering, members are dispersed across the genome. The largest group (478 genes, predominantly hypothetical proteins of similar GC content and length) shows genuine sequence-level coherence above null expectation: subgroup analysis using composite 6-mer Jaccard and sliding-window percent identity reveals large effect sizes above singleton controls for both the 208 domain-containing members (Cohen’s d = 2.62, p = 4.9 × 10⁻⁹¹) and the 270 hypothetical protein members (d = 2.55, p = 7.0 × 10⁻⁸⁸). These effect sizes substantially exceed the near-zero d = 0.06 observed for random gene pairs under the composition-matched null, indicating that the group reflects genuine distant paralogy rather than compositional convergence. The subgroup also contains a preponderance of repeat-domain proteins (ankyrin, F-box, MORN, DHFR-like: 208 of 478), consistent with a MITE-derived expansion of short repetitive elements as documented by Sun et al. (2015). Alignment-based methods (MMseqs2, CD-HIT, or HMM profiles) are needed to delineate specific sub-lineages within this group; for now it is best treated as a compositionally coherent set of likely distant paralogs. Null calibration confirmed that the diffuse pairwise similarity cloud of the full proteome (mean 0.109 vs Mimivirus 0.069) is fully explained by</w:t>
+        <w:t xml:space="preserve">, encompassing 36% of genes; the remaining 64.1% are compositional singletons with no detectable similar partners. Of the 12 groups, the most biologically interpretable are small families of repeat-domain proteins (Fascin-like: 12 members; ankyrin: 8, 4, and 2 members) with no tandem clustering, members are dispersed across the genome. The largest group (478 genes, predominantly hypothetical proteins of similar GC content and length) shows genuine sequence-level coherence above null expectation: subgroup analysis using composite 6-mer Jaccard and sliding-window percent identity reveals large effect sizes above singleton controls for both the 208 domain-containing members (Cohen’s d = 2.62, p = 4.9 × 10⁻⁹¹) and the 270 hypothetical protein members (d = 2.55, p = 7.0 × 10⁻⁸⁸). These effect sizes substantially exceed the near-zero d = 0.06 observed for random gene pairs under the composition-matched null, indicating that the group reflects genuine distant paralogy rather than compositional convergence. The subgroup also contains a preponderance of repeat-domain proteins (ankyrin, F-box, MORN, DHFR-like: 208 of 478), consistent with a MITE-derived expansion of short repetitive elements as documented by Sun et al. (2015). To probe the internal structure of this composition-defined group, we performed all-vs-all BLASTp alignment (Camacho et al. 2009) on the 478 protein sequences and clustered the resulting hits at three stringency levels (E ≤ 10⁻³ to 10⁻¹⁰; ≥ 20–30% identity; ≥ 50–80% query coverage). Even at the most lenient threshold, the compositional group decomposes into one major homology cluster of 106 proteins (~22% of the family, dominated by ankyrin and F-box repeat domains), 41 smaller clusters (148 proteins total), and 224 singletons (47%) with no significant sequence-level homolog inside the family; at stringent thresholds, the largest cluster shrinks to 46 proteins and singletons rise to 64% (Supplementary Table S12). This decomposition supports a mixed-origin interpretation: the largest sub-cluster is consistent with MITE-mediated paralogous expansion, while the majority of compositionally similar genes do not share detectable sequence-level homology with one another. The compositional grouping captures shared base/codon constraints rather than uniform paralogy, strengthening rather than weakening the conclusion that genome expansion is dominated by non-duplicative origination. Null calibration confirmed that the diffuse pairwise similarity cloud of the full proteome (mean 0.109 vs Mimivirus 0.069) is fully explained by</w:t>
       </w:r>
       <w:r>
         <w:t xml:space="preserve"> </w:t>
@@ -1795,18 +1681,18 @@
               <w:pStyle w:val="Compact"/>
             </w:pPr>
             <w:r>
-              <w:t xml:space="preserve">,</w:t>
-            </w:r>
-          </w:p>
-        </w:tc>
-        <w:tc>
-          <w:tcPr/>
-          <w:p>
-            <w:pPr>
-              <w:pStyle w:val="Compact"/>
-            </w:pPr>
-            <w:r>
-              <w:t xml:space="preserve">,</w:t>
+              <w:t xml:space="preserve">n/a</w:t>
+            </w:r>
+          </w:p>
+        </w:tc>
+        <w:tc>
+          <w:tcPr/>
+          <w:p>
+            <w:pPr>
+              <w:pStyle w:val="Compact"/>
+            </w:pPr>
+            <w:r>
+              <w:t xml:space="preserve">n/a</w:t>
             </w:r>
           </w:p>
         </w:tc>
@@ -1874,18 +1760,18 @@
               <w:pStyle w:val="Compact"/>
             </w:pPr>
             <w:r>
-              <w:t xml:space="preserve">,</w:t>
-            </w:r>
-          </w:p>
-        </w:tc>
-        <w:tc>
-          <w:tcPr/>
-          <w:p>
-            <w:pPr>
-              <w:pStyle w:val="Compact"/>
-            </w:pPr>
-            <w:r>
-              <w:t xml:space="preserve">,</w:t>
+              <w:t xml:space="preserve">n/a</w:t>
+            </w:r>
+          </w:p>
+        </w:tc>
+        <w:tc>
+          <w:tcPr/>
+          <w:p>
+            <w:pPr>
+              <w:pStyle w:val="Compact"/>
+            </w:pPr>
+            <w:r>
+              <w:t xml:space="preserve">n/a</w:t>
             </w:r>
           </w:p>
         </w:tc>
@@ -2038,7 +1924,23 @@
         <w:pStyle w:val="FirstParagraph"/>
       </w:pPr>
       <w:r>
-        <w:t xml:space="preserve">To validate the computationally predicted regulatory signals, we compared poly-A/T run positions against experimentally informed gene annotations from Legendre et al. (2018). After filtering to 11,640 intergenic runs and applying strand-aware classification, we found that 74% of boundary-associated runs occupied the correct regulatory position, poly-A upstream on the sense strand or poly-T upstream on the antisense strand for promoters, and the converse for terminators (binomial p &lt; 10⁻⁶).</w:t>
+        <w:t xml:space="preserve">To validate the computationally predicted regulatory signals, we compared poly-A/T run positions against experimentally informed gene annotations from Legendre et al. (2018). After filtering to 11,640 intergenic runs and applying strand-aware classification, we found that 3,559 of 4,810 boundary-associated runs (74.0%; Wilson 95% CI 72.7%–75.2%) occupied the correct regulatory position, poly-A upstream on the sense strand or poly-T upstream on the antisense strand for promoters, and the converse for terminators (two-sided binomial test against H₀: p = 0.5; z = 33.3, p ≈ 8.4 × 10⁻²⁵³). Applying the same procedure to</w:t>
+      </w:r>
+      <w:r>
+        <w:t xml:space="preserve"> </w:t>
+      </w:r>
+      <w:r>
+        <w:rPr>
+          <w:i/>
+          <w:iCs/>
+        </w:rPr>
+        <w:t xml:space="preserve">P. dulcis</w:t>
+      </w:r>
+      <w:r>
+        <w:t xml:space="preserve"> </w:t>
+      </w:r>
+      <w:r>
+        <w:t xml:space="preserve">yields formal genus-level replication: 3,956 of 6,403 boundary-associated runs (61.8%; Wilson 95% CI 60.6%–63.0%) occupy the correct regulatory orientation (z = 18.9, p ≈ 6.0 × 10⁻⁸⁰).</w:t>
       </w:r>
     </w:p>
     <w:p>
@@ -3384,7 +3286,7 @@
     </w:p>
     <w:bookmarkEnd w:id="17"/>
     <w:bookmarkEnd w:id="18"/>
-    <w:bookmarkStart w:id="26" w:name="discussion"/>
+    <w:bookmarkStart w:id="27" w:name="discussion"/>
     <w:p>
       <w:pPr>
         <w:pStyle w:val="Heading2"/>
@@ -3555,6 +3457,14 @@
         <w:pStyle w:val="BodyText"/>
       </w:pPr>
       <w:r>
+        <w:t xml:space="preserve">The proposal that AT-rich non-coding sequence pre-loads regulatory potential is consistent with the broader yeast-based finding that thymine-rich intergenic regions harbor a widespread capacity to generate adaptive transmembrane peptides (Vakirlis et al. 2020). In both systems, the non-coding compartment is characterized as a regulatory substrate from which functional sequences can be selected, rather than as a passive backdrop. The convergence of compositional preconditioning across yeast (Vakirlis et al. 2020) and Pandoravirus (this work) suggests that regulatory-substrate-first models of de novo gene birth may generalize beyond either system.</w:t>
+      </w:r>
+    </w:p>
+    <w:p>
+      <w:pPr>
+        <w:pStyle w:val="BodyText"/>
+      </w:pPr>
+      <w:r>
         <w:t xml:space="preserve">The homology landscape reveals three distinct ecological narratives within the non-self hit taxonomy. The NCLDV connection (24 hits, 25.3%) represents the ancestral viral gene pool shared within the Nucleocytoviricota. The marine ecological network (28 algae + 13 Amoebozoa = 41 hits, 43.2%) reflects gene exchange within a shared coastal aquatic habitat; the prevalence of marine algal sequences among NCLDV homologs is consistent with broad ecological exchange between giant viruses and their algal hosts documented by Moniruzzaman et al. (2020) and with the taxonomic framework described by Aylward et al. (2021). The endosymbiont signal (11 insect + 11 bacteria = 22 hits, 23.2%) is dominated by ankyrin repeats and likely reflects a shared bacterial HGT reservoir mediated by Wolbachia endosymbionts. The product-level gradient from ankyrin (42.3% non-self hit rate) through F-box (8.7%) to Fascin and Atrophin (0%) provides a temporal dimension for domain acquisition or divergence.</w:t>
       </w:r>
     </w:p>
@@ -3928,7 +3838,15 @@
         <w:pStyle w:val="BodyText"/>
       </w:pPr>
       <w:r>
-        <w:t xml:space="preserve">The gene family analysis warrants several explicit caveats. The 3-mer cosine similarity method, even with the adaptive GC-normalized threshold, is a compositional clustering tool, not a sequence homology detector. Clusters reflect compositional similarity, shared k-mer frequencies, which may correlate with but does not confirm true paralogy. The 478-gene group, now supported by subgroup sequence similarity analysis (d = 2.55–2.62), most likely reflects distant paralogy, possibly MITE-related repeat expansion, rather than compositional noise alone; however, alignment-based validation (MMseqs2, CD-HIT, HMM profiles) is required to delineate specific paralogy sub-lineages within this group and to determine how many distinct ancestral sequences gave rise to its members. Benchmarking the adaptive 3-mer method against established family detection algorithms on at least Mimivirus and</w:t>
+        <w:t xml:space="preserve">The gene family analysis warrants several explicit caveats. The 3-mer cosine similarity method, even with the adaptive GC-normalized threshold, is a compositional clustering tool, not a sequence homology detector. Clusters reflect compositional similarity, shared k-mer frequencies, which may correlate with but does not confirm true paralogy. To validate the inference that the largest 478-gene compositional group reflects distant paralogy rather than compositional noise alone, we performed all-vs-all BLASTp clustering of the 478 family members (E ≤ 10⁻³, ≥ 20% identity, ≥ 50% query coverage; connected-components clustering on the resulting hits). The compositional group decomposes into 266 distinct sequence-level clusters: one major homology group of 106 proteins (~22% of the family, dominated by ankyrin and F-box repeat domains), 41 smaller multi-member clusters (2–18 proteins each, totaling 148 proteins), and 224 singletons (47%) with no significant sequence-level homolog inside the family. At more stringent thresholds (E ≤ 10⁻¹⁰, ≥ 30% identity, ≥ 80% query coverage), the largest cluster shrinks to 46 proteins and singletons rise to 64%. This decomposition supports a mixed-origin interpretation: the largest sub-cluster is consistent with MITE-mediated or repeat-domain paralogous expansion (Sun et al. 2015), while the majority of compositionally similar genes do not share detectable sequence-level homology with one another, consistent with shared base/codon constraints rather than uniform paralogy. The qualitative conclusion that genome expansion is dominated by non-duplicative origination is therefore strengthened, not weakened, by alignment-based validation. Sub-lineage delineation within the largest sub-cluster using HMM profiles or domain-aware methods (HHpred, Pfam) remains a planned step. Sensitivity analysis at the 95th and 99.5th percentile thresholds confirms that qualitative conclusions, high singleton rates, no massive whole-gene duplication, are robust to threshold choice (Supplementary Table S5). Cross-genome comparisons of singleton rates should also account for the fact that annotation quality varies substantially: Mollivirus at 80.7% hypothetical proteins and Pithovirus at 72.8% are less well-characterized than Mimivirus at 54.0%.</w:t>
+      </w:r>
+    </w:p>
+    <w:p>
+      <w:pPr>
+        <w:pStyle w:val="BodyText"/>
+      </w:pPr>
+      <w:r>
+        <w:t xml:space="preserve">To clarify the scope of the comparative analysis: Modules 2–7 (compositional architecture, null models, codon usage, gene prediction, GMM, gene families) were applied to all five NCLDV genomes. Module 8 (ESM-2 protein structure) was applied to</w:t>
       </w:r>
       <w:r>
         <w:t xml:space="preserve"> </w:t>
@@ -3944,15 +3862,7 @@
         <w:t xml:space="preserve"> </w:t>
       </w:r>
       <w:r>
-        <w:t xml:space="preserve">remains a planned but incomplete step. Sensitivity analysis at the 95th and 99.5th percentile thresholds confirms that qualitative conclusions, high singleton rates, no massive whole-gene duplication, are robust to threshold choice (Supplementary Table S5). Cross-genome comparisons of singleton rates should also account for the fact that annotation quality varies substantially: Mollivirus at 80.7% hypothetical proteins and Pithovirus at 72.8% are less well-characterized than Mimivirus at 54.0%.</w:t>
-      </w:r>
-    </w:p>
-    <w:p>
-      <w:pPr>
-        <w:pStyle w:val="BodyText"/>
-      </w:pPr>
-      <w:r>
-        <w:t xml:space="preserve">To clarify the scope of the comparative analysis: Modules 2–7 (compositional architecture, null models, codon usage, gene prediction, GMM, gene families) were applied to all five NCLDV genomes. Module 8 (ESM-2 protein structure) was applied to</w:t>
+        <w:t xml:space="preserve">only for the primary mechanistic findings. Module 9 (regulatory signal analysis) was applied to</w:t>
       </w:r>
       <w:r>
         <w:t xml:space="preserve"> </w:t>
@@ -3968,7 +3878,23 @@
         <w:t xml:space="preserve"> </w:t>
       </w:r>
       <w:r>
-        <w:t xml:space="preserve">only for the primary mechanistic findings. Module 9 (regulatory signal analysis) was applied to</w:t>
+        <w:t xml:space="preserve">as the primary genome of study, with comparative analysis additionally performed on</w:t>
+      </w:r>
+      <w:r>
+        <w:t xml:space="preserve"> </w:t>
+      </w:r>
+      <w:r>
+        <w:rPr>
+          <w:i/>
+          <w:iCs/>
+        </w:rPr>
+        <w:t xml:space="preserve">P. dulcis</w:t>
+      </w:r>
+      <w:r>
+        <w:t xml:space="preserve"> </w:t>
+      </w:r>
+      <w:r>
+        <w:t xml:space="preserve">to validate genus-level generalization. Module 11 (BLASTp homology analysis) was completed exhaustively for both</w:t>
       </w:r>
       <w:r>
         <w:t xml:space="preserve"> </w:t>
@@ -3984,7 +3910,7 @@
         <w:t xml:space="preserve"> </w:t>
       </w:r>
       <w:r>
-        <w:t xml:space="preserve">as the primary genome of study, with comparative analysis additionally performed on</w:t>
+        <w:t xml:space="preserve">and</w:t>
       </w:r>
       <w:r>
         <w:t xml:space="preserve"> </w:t>
@@ -3997,10 +3923,7 @@
         <w:t xml:space="preserve">P. dulcis</w:t>
       </w:r>
       <w:r>
-        <w:t xml:space="preserve"> </w:t>
-      </w:r>
-      <w:r>
-        <w:t xml:space="preserve">to validate genus-level generalization. Module 11 (BLASTp homology analysis) was completed exhaustively for both</w:t>
+        <w:t xml:space="preserve">. Comparative claims therefore reflect different levels of evidence: all five-genome claims are cross-genome Module 2–7 results, while protein structure findings are</w:t>
       </w:r>
       <w:r>
         <w:t xml:space="preserve"> </w:t>
@@ -4013,10 +3936,23 @@
         <w:t xml:space="preserve">P. salinus</w:t>
       </w:r>
       <w:r>
-        <w:t xml:space="preserve"> </w:t>
-      </w:r>
-      <w:r>
-        <w:t xml:space="preserve">and</w:t>
+        <w:t xml:space="preserve">-specific and regulatory signal findings are</w:t>
+      </w:r>
+      <w:r>
+        <w:t xml:space="preserve"> </w:t>
+      </w:r>
+      <w:r>
+        <w:rPr>
+          <w:i/>
+          <w:iCs/>
+        </w:rPr>
+        <w:t xml:space="preserve">P. salinus</w:t>
+      </w:r>
+      <w:r>
+        <w:t xml:space="preserve"> </w:t>
+      </w:r>
+      <w:r>
+        <w:t xml:space="preserve">primary with</w:t>
       </w:r>
       <w:r>
         <w:t xml:space="preserve"> </w:t>
@@ -4029,7 +3965,73 @@
         <w:t xml:space="preserve">P. dulcis</w:t>
       </w:r>
       <w:r>
-        <w:t xml:space="preserve">. Comparative claims therefore reflect different levels of evidence: all five-genome claims are cross-genome Module 2–7 results, while protein structure findings are</w:t>
+        <w:t xml:space="preserve"> </w:t>
+      </w:r>
+      <w:r>
+        <w:t xml:space="preserve">validation.</w:t>
+      </w:r>
+    </w:p>
+    <w:p>
+      <w:pPr>
+        <w:pStyle w:val="BodyText"/>
+      </w:pPr>
+      <w:r>
+        <w:t xml:space="preserve">The transcriptomic validation used GFF annotations informed by RNA-seq data rather than raw read-level TSS/TTS coordinates, which are not publicly available; direct comparison of predicted regulatory signals against experimentally determined transcript boundaries would provide stronger validation. ESM-2 embeddings are a structural proxy, not actual 3D structure predictions. The hypothetical gene subsample (n = 299) represents approximately one-third of all hypothetical genes; the 91.4% overall orphan estimate is extrapolated from this subsample and should be interpreted accordingly. Compositional methods reveal evolutionary history but cannot determine gene expression, functionality, or essentiality. The CAI reference used general</w:t>
+      </w:r>
+      <w:r>
+        <w:t xml:space="preserve"> </w:t>
+      </w:r>
+      <w:r>
+        <w:rPr>
+          <w:i/>
+          <w:iCs/>
+        </w:rPr>
+        <w:t xml:space="preserve">A. castellanii</w:t>
+      </w:r>
+      <w:r>
+        <w:t xml:space="preserve"> </w:t>
+      </w:r>
+      <w:r>
+        <w:t xml:space="preserve">codon frequencies rather than a highly-expressed gene subset; all five viruses analyzed here infect</w:t>
+      </w:r>
+      <w:r>
+        <w:t xml:space="preserve"> </w:t>
+      </w:r>
+      <w:r>
+        <w:rPr>
+          <w:i/>
+          <w:iCs/>
+        </w:rPr>
+        <w:t xml:space="preserve">Acanthamoeba</w:t>
+      </w:r>
+      <w:r>
+        <w:t xml:space="preserve">, making this a consistent reference across the dataset, but CAI values are valid for relative comparisons and not absolute measures of translational optimization. Multiple statistical tests were performed across 12 analytical modules; we distinguish confirmatory tests (pre-specified as direct tests of central hypotheses: proto-gene codon usage comparison, strand-aware 74% binomial test, annotated-vs-hypothetical Fisher’s exact test, and two-population AT run test) from exploratory comparisons (k-mer enrichment profiles, cross-genome metrics, spatial subgroup analyses). All within-genome gene comparisons assume independence of individual gene statistics, but genes share evolutionary history; p-values for within-genome comparisons should be interpreted as measures of consistency and effect magnitude rather than calibrated false-positive rates.</w:t>
+      </w:r>
+    </w:p>
+    <w:p>
+      <w:pPr>
+        <w:pStyle w:val="BodyText"/>
+      </w:pPr>
+      <w:r>
+        <w:t xml:space="preserve">Finally, the analysis pipeline was developed with AI tool assistance (see Use of AI Tools); while all results were independently verified, the analytical design reflects a human-AI collaborative process.</w:t>
+      </w:r>
+    </w:p>
+    <w:bookmarkEnd w:id="24"/>
+    <w:bookmarkStart w:id="25" w:name="implications"/>
+    <w:p>
+      <w:pPr>
+        <w:pStyle w:val="Heading3"/>
+      </w:pPr>
+      <w:r>
+        <w:t xml:space="preserve">Implications</w:t>
+      </w:r>
+    </w:p>
+    <w:p>
+      <w:pPr>
+        <w:pStyle w:val="FirstParagraph"/>
+      </w:pPr>
+      <w:r>
+        <w:t xml:space="preserve">Three implications follow from the model presented here. First, for understanding NCLDV genome expansion: the cross-NCLDV evidence that singleton-dominated proteomes and translational selection toward host codon usage are broadly conserved features (this study) places the question of giant virus genome growth squarely in the domain of de novo gene origination rather than acquisition. The dominant growth mechanism is not what large genomes import from outside but what they generate from their own non-coding sequence. Second, for the de novo gene birth field: the</w:t>
       </w:r>
       <w:r>
         <w:t xml:space="preserve"> </w:t>
@@ -4042,88 +4044,38 @@
         <w:t xml:space="preserve">P. salinus</w:t>
       </w:r>
       <w:r>
-        <w:t xml:space="preserve">-specific and regulatory signal findings are</w:t>
-      </w:r>
-      <w:r>
-        <w:t xml:space="preserve"> </w:t>
-      </w:r>
-      <w:r>
-        <w:rPr>
-          <w:i/>
-          <w:iCs/>
-        </w:rPr>
-        <w:t xml:space="preserve">P. salinus</w:t>
-      </w:r>
-      <w:r>
-        <w:t xml:space="preserve"> </w:t>
-      </w:r>
-      <w:r>
-        <w:t xml:space="preserve">primary with</w:t>
-      </w:r>
-      <w:r>
-        <w:t xml:space="preserve"> </w:t>
-      </w:r>
-      <w:r>
-        <w:rPr>
-          <w:i/>
-          <w:iCs/>
-        </w:rPr>
-        <w:t xml:space="preserve">P. dulcis</w:t>
-      </w:r>
-      <w:r>
-        <w:t xml:space="preserve"> </w:t>
-      </w:r>
-      <w:r>
-        <w:t xml:space="preserve">validation.</w:t>
-      </w:r>
-    </w:p>
-    <w:p>
-      <w:pPr>
-        <w:pStyle w:val="BodyText"/>
-      </w:pPr>
-      <w:r>
-        <w:t xml:space="preserve">The transcriptomic validation used GFF annotations informed by RNA-seq data rather than raw read-level TSS/TTS coordinates, which are not publicly available; direct comparison of predicted regulatory signals against experimentally determined transcript boundaries would provide stronger validation. ESM-2 embeddings are a structural proxy, not actual 3D structure predictions. The hypothetical gene subsample (n = 299) represents approximately one-third of all hypothetical genes; the 91.4% overall orphan estimate is extrapolated from this subsample and should be interpreted accordingly. Compositional methods reveal evolutionary history but cannot determine gene expression, functionality, or essentiality. The CAI reference used general</w:t>
-      </w:r>
-      <w:r>
-        <w:t xml:space="preserve"> </w:t>
-      </w:r>
-      <w:r>
-        <w:rPr>
-          <w:i/>
-          <w:iCs/>
-        </w:rPr>
-        <w:t xml:space="preserve">A. castellanii</w:t>
-      </w:r>
-      <w:r>
-        <w:t xml:space="preserve"> </w:t>
-      </w:r>
-      <w:r>
-        <w:t xml:space="preserve">codon frequencies rather than a highly-expressed gene subset; all five viruses analyzed here infect</w:t>
-      </w:r>
-      <w:r>
-        <w:t xml:space="preserve"> </w:t>
-      </w:r>
-      <w:r>
-        <w:rPr>
-          <w:i/>
-          <w:iCs/>
-        </w:rPr>
-        <w:t xml:space="preserve">Acanthamoeba</w:t>
-      </w:r>
-      <w:r>
-        <w:t xml:space="preserve">, making this a consistent reference across the dataset, but CAI values are valid for relative comparisons and not absolute measures of translational optimization. Multiple statistical tests were performed across 12 analytical modules; we distinguish confirmatory tests (pre-specified as direct tests of central hypotheses: proto-gene codon usage comparison, strand-aware 74% binomial test, annotated-vs-hypothetical Fisher’s exact test, and two-population AT run test) from exploratory comparisons (k-mer enrichment profiles, cross-genome metrics, spatial subgroup analyses). All within-genome gene comparisons assume independence of individual gene statistics, but genes share evolutionary history; p-values for within-genome comparisons should be interpreted as measures of consistency and effect magnitude rather than calibrated false-positive rates.</w:t>
-      </w:r>
-    </w:p>
-    <w:p>
-      <w:pPr>
-        <w:pStyle w:val="BodyText"/>
-      </w:pPr>
-      <w:r>
-        <w:t xml:space="preserve">Finally, the analysis pipeline was developed with AI tool assistance (see Use of AI Tools); while all results were independently verified, the analytical design reflects a human-AI collaborative process.</w:t>
-      </w:r>
-    </w:p>
-    <w:bookmarkEnd w:id="24"/>
-    <w:bookmarkStart w:id="25" w:name="predictions"/>
+        <w:t xml:space="preserve"> </w:t>
+      </w:r>
+      <w:r>
+        <w:t xml:space="preserve">findings reframe the central question from</w:t>
+      </w:r>
+      <w:r>
+        <w:t xml:space="preserve"> </w:t>
+      </w:r>
+      <w:r>
+        <w:t xml:space="preserve">“how does a non-coding sequence acquire the coding properties of a gene?”</w:t>
+      </w:r>
+      <w:r>
+        <w:t xml:space="preserve"> </w:t>
+      </w:r>
+      <w:r>
+        <w:t xml:space="preserve">to</w:t>
+      </w:r>
+      <w:r>
+        <w:t xml:space="preserve"> </w:t>
+      </w:r>
+      <w:r>
+        <w:t xml:space="preserve">“how is a non-coding sequence wrapped in regulatory infrastructure that allows nascent ORFs to be expressed and tested by selection?”</w:t>
+      </w:r>
+      <w:r>
+        <w:t xml:space="preserve"> </w:t>
+      </w:r>
+      <w:r>
+        <w:t xml:space="preserve">The proto-gene continuum and the AT-rich regulatory substrate documented here are consistent with the regulatory-substrate-first framework articulated in different organisms by Vakirlis et al. (2020) and reviewed in Van Oss and Carvunis (2019), suggesting a convergent strategy across kingdoms. Third, the giant virus and de novo gene birth literatures, which have developed largely independently, are now linked by a concrete mechanistic proposal that is testable in both directions: proto-gene reporter assays in Pandoravirus would test whether the regulatory substrate functions as predicted, and Pandoravirus-style compositional analyses of yeast or fly intergenic space could assess whether AT-distributed regulatory architecture generalizes beyond the Nucleocytoviricota.</w:t>
+      </w:r>
+    </w:p>
+    <w:bookmarkEnd w:id="25"/>
+    <w:bookmarkStart w:id="26" w:name="predictions"/>
     <w:p>
       <w:pPr>
         <w:pStyle w:val="Heading3"/>
@@ -4186,9 +4138,9 @@
         </w:pict>
       </w:r>
     </w:p>
-    <w:bookmarkEnd w:id="25"/>
     <w:bookmarkEnd w:id="26"/>
-    <w:bookmarkStart w:id="32" w:name="materials-and-methods"/>
+    <w:bookmarkEnd w:id="27"/>
+    <w:bookmarkStart w:id="33" w:name="materials-and-methods"/>
     <w:p>
       <w:pPr>
         <w:pStyle w:val="Heading2"/>
@@ -4197,7 +4149,7 @@
         <w:t xml:space="preserve">Materials and Methods</w:t>
       </w:r>
     </w:p>
-    <w:bookmarkStart w:id="27" w:name="genome-and-database"/>
+    <w:bookmarkStart w:id="28" w:name="genome-and-database"/>
     <w:p>
       <w:pPr>
         <w:pStyle w:val="Heading3"/>
@@ -4302,8 +4254,8 @@
         <w:t xml:space="preserve">(NC_027867.1; 651,523 bp, 523 annotated CDS). Together, the five NCLDV genomes span GC contents from 28.0% to 63.7%, genome sizes from 610 kb to 2.5 Mb, and four distinct families (Mimiviridae, Pandoraviridae, Pithoviridae, Molliviridae). The database schema comprises 22 tables including position-indexed nucleotide sequences, gene annotations, intergenic regions, codon usage statistics, and derived analytical tables. All analyses used Python 3.11 with BioPython 1.86, NumPy, SciPy, scikit-learn, and matplotlib.</w:t>
       </w:r>
     </w:p>
-    <w:bookmarkEnd w:id="27"/>
-    <w:bookmarkStart w:id="28" w:name="X8eea81e04a9b0e3358f596335c459e8c3fc2e76"/>
+    <w:bookmarkEnd w:id="28"/>
+    <w:bookmarkStart w:id="29" w:name="X8eea81e04a9b0e3358f596335c459e8c3fc2e76"/>
     <w:p>
       <w:pPr>
         <w:pStyle w:val="Heading3"/>
@@ -4609,8 +4561,8 @@
         <w:t xml:space="preserve">proteins spanning all tiers and compositional clusters. PCA reduction (top 20 components, 85.8% variance) followed by hierarchical clustering identified structural families. Null calibration confirmed structural signal genuineness (within-family similarity 0.533 vs null 0.368; Cohen’s d = 1.45), though 41% of PC1 variance correlates with GC content, indicating a partial compositional confound.</w:t>
       </w:r>
     </w:p>
-    <w:bookmarkEnd w:id="28"/>
-    <w:bookmarkStart w:id="29" w:name="regulatory-signal-analysis-module-9"/>
+    <w:bookmarkEnd w:id="29"/>
+    <w:bookmarkStart w:id="30" w:name="regulatory-signal-analysis-module-9"/>
     <w:p>
       <w:pPr>
         <w:pStyle w:val="Heading3"/>
@@ -4672,8 +4624,8 @@
         <w:t xml:space="preserve">for comparative genus-level analysis.</w:t>
       </w:r>
     </w:p>
-    <w:bookmarkEnd w:id="29"/>
-    <w:bookmarkStart w:id="30" w:name="transcriptomic-validation-module-10"/>
+    <w:bookmarkEnd w:id="30"/>
+    <w:bookmarkStart w:id="31" w:name="transcriptomic-validation-module-10"/>
     <w:p>
       <w:pPr>
         <w:pStyle w:val="Heading3"/>
@@ -4706,8 +4658,8 @@
         <w:t xml:space="preserve">The two-population test compared AT composition and length distributions between boundary-proximal runs (within 200 bp of a gene boundary; n = 4,331) and dispersed intergenic runs (n = 7,309) to test whether boundary-active and dispersed runs represent distinct populations or a uniform regulatory substrate. Both the AT ratio difference (1.6 pp on a background mean of 38.3%) and the length difference were non-significant and negligible in effect size, supporting the uniform substrate model.</w:t>
       </w:r>
     </w:p>
-    <w:bookmarkEnd w:id="30"/>
-    <w:bookmarkStart w:id="31" w:name="blastp-homology-analysis-modules-1112"/>
+    <w:bookmarkEnd w:id="31"/>
+    <w:bookmarkStart w:id="32" w:name="blastp-homology-analysis-modules-1112"/>
     <w:p>
       <w:pPr>
         <w:pStyle w:val="Heading3"/>
@@ -4772,9 +4724,9 @@
         </w:pict>
       </w:r>
     </w:p>
-    <w:bookmarkEnd w:id="31"/>
     <w:bookmarkEnd w:id="32"/>
-    <w:bookmarkStart w:id="33" w:name="use-of-ai-tools"/>
+    <w:bookmarkEnd w:id="33"/>
+    <w:bookmarkStart w:id="34" w:name="use-of-ai-tools"/>
     <w:p>
       <w:pPr>
         <w:pStyle w:val="Heading2"/>
@@ -4798,8 +4750,8 @@
         </w:pict>
       </w:r>
     </w:p>
-    <w:bookmarkEnd w:id="33"/>
-    <w:bookmarkStart w:id="34" w:name="author-contributions"/>
+    <w:bookmarkEnd w:id="34"/>
+    <w:bookmarkStart w:id="35" w:name="author-contributions"/>
     <w:p>
       <w:pPr>
         <w:pStyle w:val="Heading2"/>
@@ -4823,8 +4775,8 @@
         </w:pict>
       </w:r>
     </w:p>
-    <w:bookmarkEnd w:id="34"/>
-    <w:bookmarkStart w:id="35" w:name="data-availability"/>
+    <w:bookmarkEnd w:id="35"/>
+    <w:bookmarkStart w:id="36" w:name="data-availability"/>
     <w:p>
       <w:pPr>
         <w:pStyle w:val="Heading2"/>
@@ -4864,8 +4816,8 @@
         </w:pict>
       </w:r>
     </w:p>
-    <w:bookmarkEnd w:id="35"/>
-    <w:bookmarkStart w:id="36" w:name="references"/>
+    <w:bookmarkEnd w:id="36"/>
+    <w:bookmarkStart w:id="37" w:name="references"/>
     <w:p>
       <w:pPr>
         <w:pStyle w:val="Heading2"/>
@@ -4951,6 +4903,30 @@
         <w:pStyle w:val="BodyText"/>
       </w:pPr>
       <w:r>
+        <w:t xml:space="preserve">Camacho C, Coulouris G, Avagyan V, Ma N, Papadopoulos J, Bealer K, Madden TL. 2009. BLAST+: architecture and applications.</w:t>
+      </w:r>
+      <w:r>
+        <w:t xml:space="preserve"> </w:t>
+      </w:r>
+      <w:r>
+        <w:rPr>
+          <w:i/>
+          <w:iCs/>
+        </w:rPr>
+        <w:t xml:space="preserve">BMC Bioinformatics</w:t>
+      </w:r>
+      <w:r>
+        <w:t xml:space="preserve"> </w:t>
+      </w:r>
+      <w:r>
+        <w:t xml:space="preserve">10:421.</w:t>
+      </w:r>
+    </w:p>
+    <w:p>
+      <w:pPr>
+        <w:pStyle w:val="BodyText"/>
+      </w:pPr>
+      <w:r>
         <w:t xml:space="preserve">Hyatt D, Chen GL, Locascio PF, Land ML, Larimer FW, Hauser LJ. 2010. Prodigal: prokaryotic gene recognition and translation initiation site identification.</w:t>
       </w:r>
       <w:r>
@@ -5164,6 +5140,30 @@
         <w:pStyle w:val="BodyText"/>
       </w:pPr>
       <w:r>
+        <w:t xml:space="preserve">Schlötterer C. 2015. Genes from scratch — the evolutionary fate of de novo genes.</w:t>
+      </w:r>
+      <w:r>
+        <w:t xml:space="preserve"> </w:t>
+      </w:r>
+      <w:r>
+        <w:rPr>
+          <w:i/>
+          <w:iCs/>
+        </w:rPr>
+        <w:t xml:space="preserve">Trends Genet</w:t>
+      </w:r>
+      <w:r>
+        <w:t xml:space="preserve"> </w:t>
+      </w:r>
+      <w:r>
+        <w:t xml:space="preserve">31:215–219.</w:t>
+      </w:r>
+    </w:p>
+    <w:p>
+      <w:pPr>
+        <w:pStyle w:val="BodyText"/>
+      </w:pPr>
+      <w:r>
         <w:t xml:space="preserve">Sun C, Feschotte C, Wu Z, Mueller RL. 2015. DNA transposons have colonized the genome of the giant virus</w:t>
       </w:r>
       <w:r>
@@ -5194,6 +5194,78 @@
       </w:r>
       <w:r>
         <w:t xml:space="preserve">13:38.</w:t>
+      </w:r>
+    </w:p>
+    <w:p>
+      <w:pPr>
+        <w:pStyle w:val="BodyText"/>
+      </w:pPr>
+      <w:r>
+        <w:t xml:space="preserve">Vakirlis N, Acar O, Hsu B, Castilho Coelho N, Van Oss SB, Wacholder A, Medetgul-Ernar K, Bowman RW 2nd, Hines CP, Iannotta J, et al. 2020. De novo emergence of adaptive membrane proteins from thymine-rich genomic sequences.</w:t>
+      </w:r>
+      <w:r>
+        <w:t xml:space="preserve"> </w:t>
+      </w:r>
+      <w:r>
+        <w:rPr>
+          <w:i/>
+          <w:iCs/>
+        </w:rPr>
+        <w:t xml:space="preserve">Nat Commun</w:t>
+      </w:r>
+      <w:r>
+        <w:t xml:space="preserve"> </w:t>
+      </w:r>
+      <w:r>
+        <w:t xml:space="preserve">11:781.</w:t>
+      </w:r>
+    </w:p>
+    <w:p>
+      <w:pPr>
+        <w:pStyle w:val="BodyText"/>
+      </w:pPr>
+      <w:r>
+        <w:t xml:space="preserve">Van Oss SB, Carvunis AR. 2019. De novo gene birth.</w:t>
+      </w:r>
+      <w:r>
+        <w:t xml:space="preserve"> </w:t>
+      </w:r>
+      <w:r>
+        <w:rPr>
+          <w:i/>
+          <w:iCs/>
+        </w:rPr>
+        <w:t xml:space="preserve">PLoS Genet</w:t>
+      </w:r>
+      <w:r>
+        <w:t xml:space="preserve"> </w:t>
+      </w:r>
+      <w:r>
+        <w:t xml:space="preserve">15:e1008160.</w:t>
+      </w:r>
+    </w:p>
+    <w:p>
+      <w:pPr>
+        <w:pStyle w:val="BodyText"/>
+      </w:pPr>
+      <w:r>
+        <w:t xml:space="preserve">Wilson BA, Foy SF, Neme R, Masel J. 2017. Young genes are highly disordered as predicted by the preadaptation hypothesis of de novo gene birth.</w:t>
+      </w:r>
+      <w:r>
+        <w:t xml:space="preserve"> </w:t>
+      </w:r>
+      <w:r>
+        <w:rPr>
+          <w:i/>
+          <w:iCs/>
+        </w:rPr>
+        <w:t xml:space="preserve">Nat Ecol Evol</w:t>
+      </w:r>
+      <w:r>
+        <w:t xml:space="preserve"> </w:t>
+      </w:r>
+      <w:r>
+        <w:t xml:space="preserve">1:0146.</w:t>
       </w:r>
     </w:p>
     <w:p>
@@ -5203,8 +5275,8 @@
         </w:pict>
       </w:r>
     </w:p>
-    <w:bookmarkEnd w:id="36"/>
-    <w:bookmarkStart w:id="37" w:name="figure-legends"/>
+    <w:bookmarkEnd w:id="37"/>
+    <w:bookmarkStart w:id="38" w:name="figure-legends"/>
     <w:p>
       <w:pPr>
         <w:pStyle w:val="Heading2"/>
@@ -5254,7 +5326,7 @@
         <w:t xml:space="preserve"> </w:t>
       </w:r>
       <w:r>
-        <w:t xml:space="preserve">(A) Meta-gene AT content profile showing +10.3 pp spike at gene starts and +9.8 pp spike at gene ends. (B) Strand-aware classification of poly-A/T runs: 74% in correct regulatory position (binomial p &lt; 10⁻⁶). (C) Comparison of AT boundary signal strength across Lambda, Mimivirus, and</w:t>
+        <w:t xml:space="preserve">(A) Meta-gene AT content profile showing +10.3 pp spike at gene starts and +9.8 pp spike at gene ends. (B) Strand-aware classification of poly-A/T runs: 74% in correct regulatory position (3,559/4,810; two-sided binomial p ≈ 8 × 10⁻²⁵³). (C) Comparison of AT boundary signal strength across Lambda, Mimivirus, and</w:t>
       </w:r>
       <w:r>
         <w:t xml:space="preserve"> </w:t>
@@ -5293,7 +5365,7 @@
         <w:t xml:space="preserve"> </w:t>
       </w:r>
       <w:r>
-        <w:t xml:space="preserve">(A) Taxonomic distribution of non-self top BLAST hits (n = 95), showing eukaryote-dominated pattern with marine algae (29.5%) and giant viruses (25.3%) as the largest categories. (B) Percent identity distribution of non-self hits (median 42.3%). (C) Product-level non-self hit rates, showing gradient from ankyrin (42.3%) through F-box (8.7%) to Pandoravirus-specific domains (Fascin, DHFR, Atrophin, Ring finger: 0%). (D) Spatial distribution of non-self homology hits across the genome, with points colored by taxonomy and the native zone (1.3–2.0 Mb, shaded) highlighted (45/95 hits, OR = 1.94, p = 0.004). (E) Identity distribution by taxonomic category.</w:t>
+        <w:t xml:space="preserve">(A) Taxonomic distribution of non-self top BLAST hits (n = 95), showing eukaryote-dominated pattern with marine algae (29.5%) and giant viruses (25.3%) as the largest categories. (B) Percent identity distribution of non-self hits (median 42.3%). (C) Product-level non-self hit rates, showing gradient from ankyrin (42.3%) through F-box (8.7%) to Pandoravirus-specific domains (Fascin, DHFR, Atrophin, Ring finger: 0%). Categories with n &lt; 10 (Ubiquitin, n = 5; BTB, n = 9) are shown for descriptive context only and should not be interpreted as quantitative rate estimates. (D) Spatial distribution of non-self homology hits across the genome, with points colored by taxonomy and the native zone (1.3–2.0 Mb, shaded) highlighted (45/95 hits, OR = 1.94, p = 0.004). (E) Identity distribution by taxonomic category.</w:t>
       </w:r>
     </w:p>
     <w:p>
@@ -5319,7 +5391,7 @@
         <w:t xml:space="preserve"> </w:t>
       </w:r>
       <w:r>
-        <w:t xml:space="preserve">(A) Non-self hit rates for annotated (18.2%, n = 521) versus hypothetical (3.0%, n = 299) genes, with Wilson score confidence intervals. Fisher’s exact test OR = 7.19 (95% CI: 3.5–13.6, p = 7.79 × 10⁻¹²). (B) Three-level maturation gradient: intergenic (0%) → hypothetical (3.0%) → annotated (18.2%). (C) E-value sensitivity analysis showing orphan rate stability across thresholds (81.8% at 10⁻⁵ to 90.4% at 10⁻⁵⁰).</w:t>
+        <w:t xml:space="preserve">(A) Non-self hit rates for annotated (18.2%, n = 521) versus hypothetical (3.0%, n = 299) genes, with Wilson score confidence intervals. Fisher’s exact test OR = 7.19 (95% CI: 3.5–13.6, p = 7.79 × 10⁻¹²). (B) Three-level maturation gradient: intergenic (0%) → hypothetical (3.0%) → annotated (18.2%). The intergenic 0% baseline is definitional, not empirical (non-genic sequence has no protein-coding output and therefore no protein homologs); the formal age-dependent comparison is between annotated and hypothetical genes. (C) E-value sensitivity analysis showing orphan rate stability across thresholds (81.8% at 10⁻⁵ to 90.4% at 10⁻⁵⁰).</w:t>
       </w:r>
     </w:p>
     <w:p>
@@ -5337,8 +5409,8 @@
         </w:pict>
       </w:r>
     </w:p>
-    <w:bookmarkEnd w:id="37"/>
-    <w:bookmarkStart w:id="38" w:name="supplementary-materials"/>
+    <w:bookmarkEnd w:id="38"/>
+    <w:bookmarkStart w:id="39" w:name="supplementary-materials"/>
     <w:p>
       <w:pPr>
         <w:pStyle w:val="Heading2"/>
@@ -5352,7 +5424,7 @@
         <w:pStyle w:val="FirstParagraph"/>
       </w:pPr>
       <w:r>
-        <w:t xml:space="preserve">Supplementary Tables S1–S10 and Supplementary Figures S1–S9 are provided in a single supplementary PDF file.</w:t>
+        <w:t xml:space="preserve">Supplementary Tables S1–S12 and Supplementary Figures S1–S9 are provided in a single supplementary PDF file.</w:t>
       </w:r>
     </w:p>
     <w:p>
@@ -7294,6 +7366,84 @@
           <w:b/>
           <w:bCs/>
         </w:rPr>
+        <w:t xml:space="preserve">Supplementary Table S11.</w:t>
+      </w:r>
+      <w:r>
+        <w:t xml:space="preserve"> </w:t>
+      </w:r>
+      <w:r>
+        <w:t xml:space="preserve">Scope of generalization across findings: per-finding annotation of genome scope at which evidence was collected (</w:t>
+      </w:r>
+      <w:r>
+        <w:rPr>
+          <w:i/>
+          <w:iCs/>
+        </w:rPr>
+        <w:t xml:space="preserve">P. salinus</w:t>
+      </w:r>
+      <w:r>
+        <w:t xml:space="preserve">-only,</w:t>
+      </w:r>
+      <w:r>
+        <w:t xml:space="preserve"> </w:t>
+      </w:r>
+      <w:r>
+        <w:rPr>
+          <w:i/>
+          <w:iCs/>
+        </w:rPr>
+        <w:t xml:space="preserve">P. salinus</w:t>
+      </w:r>
+      <w:r>
+        <w:t xml:space="preserve"> </w:t>
+      </w:r>
+      <w:r>
+        <w:t xml:space="preserve">+</w:t>
+      </w:r>
+      <w:r>
+        <w:t xml:space="preserve"> </w:t>
+      </w:r>
+      <w:r>
+        <w:rPr>
+          <w:i/>
+          <w:iCs/>
+        </w:rPr>
+        <w:t xml:space="preserve">P. dulcis</w:t>
+      </w:r>
+      <w:r>
+        <w:t xml:space="preserve"> </w:t>
+      </w:r>
+      <w:r>
+        <w:t xml:space="preserve">same-genus, Pandoraviridae, or cross-NCLDV).</w:t>
+      </w:r>
+    </w:p>
+    <w:p>
+      <w:pPr>
+        <w:pStyle w:val="BodyText"/>
+      </w:pPr>
+      <w:r>
+        <w:rPr>
+          <w:b/>
+          <w:bCs/>
+        </w:rPr>
+        <w:t xml:space="preserve">Supplementary Table S12.</w:t>
+      </w:r>
+      <w:r>
+        <w:t xml:space="preserve"> </w:t>
+      </w:r>
+      <w:r>
+        <w:t xml:space="preserve">All-vs-all BLASTp clustering of the 478-gene compositional family: cluster counts, largest-cluster size, singletons, and percent of proteins falling into multi-member clusters at three stringency levels.</w:t>
+      </w:r>
+    </w:p>
+    <w:p>
+      <w:pPr>
+        <w:pStyle w:val="BodyText"/>
+      </w:pPr>
+      <w:r>
+        <w:rPr>
+          <w:b/>
+          <w:bCs/>
+        </w:rPr>
         <w:t xml:space="preserve">Supplementary Figure S1.</w:t>
       </w:r>
       <w:r>
@@ -7525,17 +7675,12 @@
         </w:pict>
       </w:r>
     </w:p>
-    <w:bookmarkEnd w:id="38"/>
     <w:bookmarkEnd w:id="39"/>
+    <w:bookmarkEnd w:id="40"/>
     <w:sectPr>
       <w:footnotePr>
         <w:numRestart w:val="eachSect"/>
       </w:footnotePr>
-      <w:pgSz w:h="15840" w:w="12240"/>
-      <w:pgMar w:bottom="1440" w:footer="720" w:gutter="0" w:header="720" w:left="1440" w:right="1440" w:top="1440"/>
-      <w:lnNumType w:countBy="1" w:restart="continuous"/>
-      <w:cols w:space="720"/>
-      <w:docGrid w:linePitch="326"/>
     </w:sectPr>
   </w:body>
 </w:document>
@@ -7565,84 +7710,7 @@
 </file>
 
 <file path=word/numbering.xml><?xml version="1.0" encoding="utf-8"?>
-<w:numbering xmlns:aink="http://schemas.microsoft.com/office/drawing/2016/ink" xmlns:am3d="http://schemas.microsoft.com/office/drawing/2017/model3d" xmlns:cx="http://schemas.microsoft.com/office/drawing/2014/chartex" xmlns:cx1="http://schemas.microsoft.com/office/drawing/2015/9/8/chartex" xmlns:cx2="http://schemas.microsoft.com/office/drawing/2015/10/21/chartex" xmlns:cx3="http://schemas.microsoft.com/office/drawing/2016/5/9/chartex" xmlns:cx4="http://schemas.microsoft.com/office/drawing/2016/5/10/chartex" xmlns:cx5="http://schemas.microsoft.com/office/drawing/2016/5/11/chartex" xmlns:cx6="http://schemas.microsoft.com/office/drawing/2016/5/12/chartex" xmlns:cx7="http://schemas.microsoft.com/office/drawing/2016/5/13/chartex" xmlns:cx8="http://schemas.microsoft.com/office/drawing/2016/5/14/chartex" xmlns:m="http://schemas.openxmlformats.org/officeDocument/2006/math" xmlns:mc="http://schemas.openxmlformats.org/markup-compatibility/2006" xmlns:o="urn:schemas-microsoft-com:office:office" xmlns:oel="http://schemas.microsoft.com/office/2019/extlst" xmlns:r="http://schemas.openxmlformats.org/officeDocument/2006/relationships" xmlns:v="urn:schemas-microsoft-com:vml" xmlns:w="http://schemas.openxmlformats.org/wordprocessingml/2006/main" xmlns:w10="urn:schemas-microsoft-com:office:word" xmlns:w14="http://schemas.microsoft.com/office/word/2010/wordml" xmlns:w15="http://schemas.microsoft.com/office/word/2012/wordml" xmlns:w16="http://schemas.microsoft.com/office/word/2018/wordml" xmlns:w16cex="http://schemas.microsoft.com/office/word/2018/wordml/cex" xmlns:w16cid="http://schemas.microsoft.com/office/word/2016/wordml/cid" xmlns:w16du="http://schemas.microsoft.com/office/word/2023/wordml/word16du" xmlns:w16sdtdh="http://schemas.microsoft.com/office/word/2020/wordml/sdtdatahash" xmlns:w16sdtfl="http://schemas.microsoft.com/office/word/2024/wordml/sdtformatlock" xmlns:w16se="http://schemas.microsoft.com/office/word/2015/wordml/symex" xmlns:wne="http://schemas.microsoft.com/office/word/2006/wordml" xmlns:wp="http://schemas.openxmlformats.org/drawingml/2006/wordprocessingDrawing" xmlns:wp14="http://schemas.microsoft.com/office/word/2010/wordprocessingDrawing" xmlns:wpc="http://schemas.microsoft.com/office/word/2010/wordprocessingCanvas" xmlns:wpg="http://schemas.microsoft.com/office/word/2010/wordprocessingGroup" xmlns:wpi="http://schemas.microsoft.com/office/word/2010/wordprocessingInk" xmlns:wps="http://schemas.microsoft.com/office/word/2010/wordprocessingShape" mc:Ignorable="w14 w15 w16se w16cid w16 w16cex w16sdtdh w16sdtfl w16du wp14">
-  <w:abstractNum w15:restartNumberingAfterBreak="0" w:abstractNumId="0">
-    <w:nsid w:val="0000A990"/>
-    <w:multiLevelType w:val="multilevel"/>
-    <w:tmpl w:val="9BAA6392"/>
-    <w:lvl w:ilvl="0">
-      <w:numFmt w:val="bullet"/>
-      <w:lvlText w:val=" "/>
-      <w:lvlJc w:val="left"/>
-      <w:pPr>
-        <w:ind w:hanging="360" w:left="720"/>
-      </w:pPr>
-    </w:lvl>
-    <w:lvl w:ilvl="1">
-      <w:numFmt w:val="bullet"/>
-      <w:lvlText w:val=" "/>
-      <w:lvlJc w:val="left"/>
-      <w:pPr>
-        <w:ind w:hanging="360" w:left="1440"/>
-      </w:pPr>
-    </w:lvl>
-    <w:lvl w:ilvl="2">
-      <w:numFmt w:val="bullet"/>
-      <w:lvlText w:val=" "/>
-      <w:lvlJc w:val="left"/>
-      <w:pPr>
-        <w:ind w:hanging="360" w:left="2160"/>
-      </w:pPr>
-    </w:lvl>
-    <w:lvl w:ilvl="3">
-      <w:numFmt w:val="bullet"/>
-      <w:lvlText w:val=" "/>
-      <w:lvlJc w:val="left"/>
-      <w:pPr>
-        <w:ind w:hanging="360" w:left="2880"/>
-      </w:pPr>
-    </w:lvl>
-    <w:lvl w:ilvl="4">
-      <w:numFmt w:val="bullet"/>
-      <w:lvlText w:val=" "/>
-      <w:lvlJc w:val="left"/>
-      <w:pPr>
-        <w:ind w:hanging="360" w:left="3600"/>
-      </w:pPr>
-    </w:lvl>
-    <w:lvl w:ilvl="5">
-      <w:numFmt w:val="bullet"/>
-      <w:lvlText w:val=" "/>
-      <w:lvlJc w:val="left"/>
-      <w:pPr>
-        <w:ind w:hanging="360" w:left="4320"/>
-      </w:pPr>
-    </w:lvl>
-    <w:lvl w:ilvl="6">
-      <w:numFmt w:val="bullet"/>
-      <w:lvlText w:val=" "/>
-      <w:lvlJc w:val="left"/>
-      <w:pPr>
-        <w:ind w:hanging="360" w:left="5040"/>
-      </w:pPr>
-    </w:lvl>
-    <w:lvl w:ilvl="7">
-      <w:numFmt w:val="bullet"/>
-      <w:lvlText w:val=" "/>
-      <w:lvlJc w:val="left"/>
-      <w:pPr>
-        <w:ind w:hanging="360" w:left="5760"/>
-      </w:pPr>
-    </w:lvl>
-    <w:lvl w:ilvl="8">
-      <w:numFmt w:val="bullet"/>
-      <w:lvlText w:val=" "/>
-      <w:lvlJc w:val="left"/>
-      <w:pPr>
-        <w:ind w:hanging="360" w:left="6480"/>
-      </w:pPr>
-    </w:lvl>
-  </w:abstractNum>
+<w:numbering xmlns:w="http://schemas.openxmlformats.org/wordprocessingml/2006/main">
   <w:abstractNum w:abstractNumId="990">
     <w:nsid w:val="0000A990"/>
     <w:multiLevelType w:val="multilevel"/>
@@ -7719,9 +7787,6 @@
       </w:pPr>
     </w:lvl>
   </w:abstractNum>
-  <w:num w16cid:durableId="264732497" w:numId="1">
-    <w:abstractNumId w:val="0"/>
-  </w:num>
   <w:num w:numId="1000">
     <w:abstractNumId w:val="990"/>
   </w:num>
@@ -7729,7 +7794,7 @@
 </file>
 
 <file path=word/styles.xml><?xml version="1.0" encoding="utf-8"?>
-<w:styles xmlns:mc="http://schemas.openxmlformats.org/markup-compatibility/2006" xmlns:r="http://schemas.openxmlformats.org/officeDocument/2006/relationships" xmlns:w="http://schemas.openxmlformats.org/wordprocessingml/2006/main" xmlns:w14="http://schemas.microsoft.com/office/word/2010/wordml" xmlns:w15="http://schemas.microsoft.com/office/word/2012/wordml" xmlns:w16="http://schemas.microsoft.com/office/word/2018/wordml" xmlns:w16cex="http://schemas.microsoft.com/office/word/2018/wordml/cex" xmlns:w16cid="http://schemas.microsoft.com/office/word/2016/wordml/cid" xmlns:w16du="http://schemas.microsoft.com/office/word/2023/wordml/word16du" xmlns:w16sdtdh="http://schemas.microsoft.com/office/word/2020/wordml/sdtdatahash" xmlns:w16sdtfl="http://schemas.microsoft.com/office/word/2024/wordml/sdtformatlock" xmlns:w16se="http://schemas.microsoft.com/office/word/2015/wordml/symex" mc:Ignorable="w14 w15 w16se w16cid w16 w16cex w16sdtdh w16sdtfl w16du">
+<w:styles xmlns:r="http://schemas.openxmlformats.org/officeDocument/2006/relationships" xmlns:w="http://schemas.openxmlformats.org/wordprocessingml/2006/main">
   <w:docDefaults>
     <w:rPrDefault>
       <w:rPr>
@@ -7745,253 +7810,166 @@
       </w:pPr>
     </w:pPrDefault>
   </w:docDefaults>
-  <w:latentStyles w:count="376" w:defLockedState="0" w:defQFormat="0" w:defSemiHidden="0" w:defUIPriority="0" w:defUnhideWhenUsed="0">
-    <w:lsdException w:name="Normal Table" w:semiHidden="1" w:unhideWhenUsed="1"/>
-    <w:lsdException w:name="Table Simple 1" w:semiHidden="1" w:unhideWhenUsed="1"/>
-    <w:lsdException w:name="Table Simple 2" w:semiHidden="1" w:unhideWhenUsed="1"/>
-    <w:lsdException w:name="Table Simple 3" w:semiHidden="1" w:unhideWhenUsed="1"/>
-    <w:lsdException w:name="Table Classic 1" w:semiHidden="1" w:unhideWhenUsed="1"/>
-    <w:lsdException w:name="Table Classic 2" w:semiHidden="1" w:unhideWhenUsed="1"/>
-    <w:lsdException w:name="Table Classic 3" w:semiHidden="1" w:unhideWhenUsed="1"/>
-    <w:lsdException w:name="Table Classic 4" w:semiHidden="1" w:unhideWhenUsed="1"/>
-    <w:lsdException w:name="Table Colorful 1" w:semiHidden="1" w:unhideWhenUsed="1"/>
-    <w:lsdException w:name="Table Colorful 2" w:semiHidden="1" w:unhideWhenUsed="1"/>
-    <w:lsdException w:name="Table Colorful 3" w:semiHidden="1" w:unhideWhenUsed="1"/>
-    <w:lsdException w:name="Table Columns 1" w:semiHidden="1" w:unhideWhenUsed="1"/>
-    <w:lsdException w:name="Table Columns 2" w:semiHidden="1" w:unhideWhenUsed="1"/>
-    <w:lsdException w:name="Table Columns 3" w:semiHidden="1" w:unhideWhenUsed="1"/>
-    <w:lsdException w:name="Table Columns 4" w:semiHidden="1" w:unhideWhenUsed="1"/>
-    <w:lsdException w:name="Table Columns 5" w:semiHidden="1" w:unhideWhenUsed="1"/>
-    <w:lsdException w:name="Table Grid 1" w:semiHidden="1" w:unhideWhenUsed="1"/>
-    <w:lsdException w:name="Table Grid 2" w:semiHidden="1" w:unhideWhenUsed="1"/>
-    <w:lsdException w:name="Table Grid 3" w:semiHidden="1" w:unhideWhenUsed="1"/>
-    <w:lsdException w:name="Table Grid 4" w:semiHidden="1" w:unhideWhenUsed="1"/>
-    <w:lsdException w:name="Table Grid 5" w:semiHidden="1" w:unhideWhenUsed="1"/>
-    <w:lsdException w:name="Table Grid 6" w:semiHidden="1" w:unhideWhenUsed="1"/>
-    <w:lsdException w:name="Table Grid 7" w:semiHidden="1" w:unhideWhenUsed="1"/>
-    <w:lsdException w:name="Table Grid 8" w:semiHidden="1" w:unhideWhenUsed="1"/>
-    <w:lsdException w:name="Table List 1" w:semiHidden="1" w:unhideWhenUsed="1"/>
-    <w:lsdException w:name="Table List 2" w:semiHidden="1" w:unhideWhenUsed="1"/>
-    <w:lsdException w:name="Table List 3" w:semiHidden="1" w:unhideWhenUsed="1"/>
-    <w:lsdException w:name="Table List 4" w:semiHidden="1" w:unhideWhenUsed="1"/>
-    <w:lsdException w:name="Table List 5" w:semiHidden="1" w:unhideWhenUsed="1"/>
-    <w:lsdException w:name="Table List 6" w:semiHidden="1" w:unhideWhenUsed="1"/>
-    <w:lsdException w:name="Table List 7" w:semiHidden="1" w:unhideWhenUsed="1"/>
-    <w:lsdException w:name="Table List 8" w:semiHidden="1" w:unhideWhenUsed="1"/>
-    <w:lsdException w:name="Table 3D effects 1" w:semiHidden="1" w:unhideWhenUsed="1"/>
-    <w:lsdException w:name="Table 3D effects 2" w:semiHidden="1" w:unhideWhenUsed="1"/>
-    <w:lsdException w:name="Table 3D effects 3" w:semiHidden="1" w:unhideWhenUsed="1"/>
-    <w:lsdException w:name="Table Contemporary" w:semiHidden="1" w:unhideWhenUsed="1"/>
-    <w:lsdException w:name="Table Elegant" w:semiHidden="1" w:unhideWhenUsed="1"/>
-    <w:lsdException w:name="Table Professional" w:semiHidden="1" w:unhideWhenUsed="1"/>
-    <w:lsdException w:name="Table Subtle 1" w:semiHidden="1" w:unhideWhenUsed="1"/>
-    <w:lsdException w:name="Table Subtle 2" w:semiHidden="1" w:unhideWhenUsed="1"/>
-    <w:lsdException w:name="Table Web 1" w:semiHidden="1" w:unhideWhenUsed="1"/>
-    <w:lsdException w:name="Table Web 2" w:semiHidden="1" w:unhideWhenUsed="1"/>
-    <w:lsdException w:name="Table Web 3" w:semiHidden="1" w:unhideWhenUsed="1"/>
-    <w:lsdException w:name="Table Theme" w:semiHidden="1" w:unhideWhenUsed="1"/>
-    <w:lsdException w:name="Light Shading"/>
-    <w:lsdException w:name="Light List"/>
-    <w:lsdException w:name="Light Grid"/>
-    <w:lsdException w:name="Medium Shading 1"/>
-    <w:lsdException w:name="Medium Shading 2"/>
-    <w:lsdException w:name="Medium List 1"/>
-    <w:lsdException w:name="Medium List 2"/>
-    <w:lsdException w:name="Medium Grid 1"/>
-    <w:lsdException w:name="Medium Grid 2"/>
-    <w:lsdException w:name="Medium Grid 3"/>
-    <w:lsdException w:name="Dark List"/>
-    <w:lsdException w:name="Colorful Shading"/>
-    <w:lsdException w:name="Colorful List"/>
-    <w:lsdException w:name="Colorful Grid"/>
-    <w:lsdException w:name="Light Shading Accent 1"/>
-    <w:lsdException w:name="Light List Accent 1"/>
-    <w:lsdException w:name="Light Grid Accent 1"/>
-    <w:lsdException w:name="Medium Shading 1 Accent 1"/>
-    <w:lsdException w:name="Medium Shading 2 Accent 1"/>
-    <w:lsdException w:name="Medium List 1 Accent 1"/>
-    <w:lsdException w:name="Medium List 2 Accent 1"/>
-    <w:lsdException w:name="Medium Grid 1 Accent 1"/>
-    <w:lsdException w:name="Medium Grid 2 Accent 1"/>
-    <w:lsdException w:name="Medium Grid 3 Accent 1"/>
-    <w:lsdException w:name="Dark List Accent 1"/>
-    <w:lsdException w:name="Colorful Shading Accent 1"/>
-    <w:lsdException w:name="Colorful List Accent 1"/>
-    <w:lsdException w:name="Colorful Grid Accent 1"/>
-    <w:lsdException w:name="Light Shading Accent 2"/>
-    <w:lsdException w:name="Light List Accent 2"/>
-    <w:lsdException w:name="Light Grid Accent 2"/>
-    <w:lsdException w:name="Medium Shading 1 Accent 2"/>
-    <w:lsdException w:name="Medium Shading 2 Accent 2"/>
-    <w:lsdException w:name="Medium List 1 Accent 2"/>
-    <w:lsdException w:name="Medium List 2 Accent 2"/>
-    <w:lsdException w:name="Medium Grid 1 Accent 2"/>
-    <w:lsdException w:name="Medium Grid 2 Accent 2"/>
-    <w:lsdException w:name="Medium Grid 3 Accent 2"/>
-    <w:lsdException w:name="Dark List Accent 2"/>
-    <w:lsdException w:name="Colorful Shading Accent 2"/>
-    <w:lsdException w:name="Colorful List Accent 2"/>
-    <w:lsdException w:name="Colorful Grid Accent 2"/>
-    <w:lsdException w:name="Light Shading Accent 3"/>
-    <w:lsdException w:name="Light List Accent 3"/>
-    <w:lsdException w:name="Light Grid Accent 3"/>
-    <w:lsdException w:name="Medium Shading 1 Accent 3"/>
-    <w:lsdException w:name="Medium Shading 2 Accent 3"/>
-    <w:lsdException w:name="Medium List 1 Accent 3"/>
-    <w:lsdException w:name="Medium List 2 Accent 3"/>
-    <w:lsdException w:name="Medium Grid 1 Accent 3"/>
-    <w:lsdException w:name="Medium Grid 2 Accent 3"/>
-    <w:lsdException w:name="Medium Grid 3 Accent 3"/>
-    <w:lsdException w:name="Dark List Accent 3"/>
-    <w:lsdException w:name="Colorful Shading Accent 3"/>
-    <w:lsdException w:name="Colorful List Accent 3"/>
-    <w:lsdException w:name="Colorful Grid Accent 3"/>
-    <w:lsdException w:name="Light Shading Accent 4"/>
-    <w:lsdException w:name="Light List Accent 4"/>
-    <w:lsdException w:name="Light Grid Accent 4"/>
-    <w:lsdException w:name="Medium Shading 1 Accent 4"/>
-    <w:lsdException w:name="Medium Shading 2 Accent 4"/>
-    <w:lsdException w:name="Medium List 1 Accent 4"/>
-    <w:lsdException w:name="Medium List 2 Accent 4"/>
-    <w:lsdException w:name="Medium Grid 1 Accent 4"/>
-    <w:lsdException w:name="Medium Grid 2 Accent 4"/>
-    <w:lsdException w:name="Medium Grid 3 Accent 4"/>
-    <w:lsdException w:name="Dark List Accent 4"/>
-    <w:lsdException w:name="Colorful Shading Accent 4"/>
-    <w:lsdException w:name="Colorful List Accent 4"/>
-    <w:lsdException w:name="Colorful Grid Accent 4"/>
-    <w:lsdException w:name="Light Shading Accent 5"/>
-    <w:lsdException w:name="Light List Accent 5"/>
-    <w:lsdException w:name="Light Grid Accent 5"/>
-    <w:lsdException w:name="Medium Shading 1 Accent 5"/>
-    <w:lsdException w:name="Medium Shading 2 Accent 5"/>
-    <w:lsdException w:name="Medium List 1 Accent 5"/>
-    <w:lsdException w:name="Medium List 2 Accent 5"/>
-    <w:lsdException w:name="Medium Grid 1 Accent 5"/>
-    <w:lsdException w:name="Medium Grid 2 Accent 5"/>
-    <w:lsdException w:name="Medium Grid 3 Accent 5"/>
-    <w:lsdException w:name="Dark List Accent 5"/>
-    <w:lsdException w:name="Colorful Shading Accent 5"/>
-    <w:lsdException w:name="Colorful List Accent 5"/>
-    <w:lsdException w:name="Colorful Grid Accent 5"/>
-    <w:lsdException w:name="Light Shading Accent 6"/>
-    <w:lsdException w:name="Light List Accent 6"/>
-    <w:lsdException w:name="Light Grid Accent 6"/>
-    <w:lsdException w:name="Medium Shading 1 Accent 6"/>
-    <w:lsdException w:name="Medium Shading 2 Accent 6"/>
-    <w:lsdException w:name="Medium List 1 Accent 6"/>
-    <w:lsdException w:name="Medium List 2 Accent 6"/>
-    <w:lsdException w:name="Medium Grid 1 Accent 6"/>
-    <w:lsdException w:name="Medium Grid 2 Accent 6"/>
-    <w:lsdException w:name="Medium Grid 3 Accent 6"/>
-    <w:lsdException w:name="Dark List Accent 6"/>
-    <w:lsdException w:name="Colorful Shading Accent 6"/>
-    <w:lsdException w:name="Colorful List Accent 6"/>
-    <w:lsdException w:name="Colorful Grid Accent 6"/>
-    <w:lsdException w:name="Grid Table 4" w:uiPriority="49"/>
-    <w:lsdException w:name="Grid Table 5 Dark" w:uiPriority="50"/>
-    <w:lsdException w:name="Grid Table 6 Colorful" w:uiPriority="51"/>
-    <w:lsdException w:name="Grid Table 7 Colorful" w:uiPriority="52"/>
-    <w:lsdException w:name="Grid Table 1 Light Accent 1" w:uiPriority="46"/>
-    <w:lsdException w:name="Grid Table 2 Accent 1" w:uiPriority="47"/>
-    <w:lsdException w:name="Grid Table 3 Accent 1" w:uiPriority="48"/>
-    <w:lsdException w:name="Grid Table 4 Accent 1" w:uiPriority="49"/>
-    <w:lsdException w:name="Grid Table 5 Dark Accent 1" w:uiPriority="50"/>
-    <w:lsdException w:name="Grid Table 6 Colorful Accent 1" w:uiPriority="51"/>
-    <w:lsdException w:name="Grid Table 7 Colorful Accent 1" w:uiPriority="52"/>
-    <w:lsdException w:name="Grid Table 1 Light Accent 2" w:uiPriority="46"/>
-    <w:lsdException w:name="Grid Table 2 Accent 2" w:uiPriority="47"/>
-    <w:lsdException w:name="Grid Table 3 Accent 2" w:uiPriority="48"/>
-    <w:lsdException w:name="Grid Table 4 Accent 2" w:uiPriority="49"/>
-    <w:lsdException w:name="Grid Table 5 Dark Accent 2" w:uiPriority="50"/>
-    <w:lsdException w:name="Grid Table 6 Colorful Accent 2" w:uiPriority="51"/>
-    <w:lsdException w:name="Grid Table 7 Colorful Accent 2" w:uiPriority="52"/>
-    <w:lsdException w:name="Grid Table 1 Light Accent 3" w:uiPriority="46"/>
-    <w:lsdException w:name="Grid Table 2 Accent 3" w:uiPriority="47"/>
-    <w:lsdException w:name="Grid Table 3 Accent 3" w:uiPriority="48"/>
-    <w:lsdException w:name="Grid Table 4 Accent 3" w:uiPriority="49"/>
-    <w:lsdException w:name="Grid Table 5 Dark Accent 3" w:uiPriority="50"/>
-    <w:lsdException w:name="Grid Table 6 Colorful Accent 3" w:uiPriority="51"/>
-    <w:lsdException w:name="Grid Table 7 Colorful Accent 3" w:uiPriority="52"/>
-    <w:lsdException w:name="Grid Table 1 Light Accent 4" w:uiPriority="46"/>
-    <w:lsdException w:name="Grid Table 2 Accent 4" w:uiPriority="47"/>
-    <w:lsdException w:name="Grid Table 3 Accent 4" w:uiPriority="48"/>
-    <w:lsdException w:name="Grid Table 4 Accent 4" w:uiPriority="49"/>
-    <w:lsdException w:name="Grid Table 5 Dark Accent 4" w:uiPriority="50"/>
-    <w:lsdException w:name="Grid Table 6 Colorful Accent 4" w:uiPriority="51"/>
-    <w:lsdException w:name="Grid Table 7 Colorful Accent 4" w:uiPriority="52"/>
-    <w:lsdException w:name="Grid Table 1 Light Accent 5" w:uiPriority="46"/>
-    <w:lsdException w:name="Grid Table 2 Accent 5" w:uiPriority="47"/>
-    <w:lsdException w:name="Grid Table 3 Accent 5" w:uiPriority="48"/>
-    <w:lsdException w:name="Grid Table 4 Accent 5" w:uiPriority="49"/>
-    <w:lsdException w:name="Grid Table 5 Dark Accent 5" w:uiPriority="50"/>
-    <w:lsdException w:name="Grid Table 6 Colorful Accent 5" w:uiPriority="51"/>
-    <w:lsdException w:name="Grid Table 7 Colorful Accent 5" w:uiPriority="52"/>
-    <w:lsdException w:name="Grid Table 1 Light Accent 6" w:uiPriority="46"/>
-    <w:lsdException w:name="Grid Table 2 Accent 6" w:uiPriority="47"/>
-    <w:lsdException w:name="Grid Table 3 Accent 6" w:uiPriority="48"/>
-    <w:lsdException w:name="Grid Table 4 Accent 6" w:uiPriority="49"/>
-    <w:lsdException w:name="Grid Table 5 Dark Accent 6" w:uiPriority="50"/>
-    <w:lsdException w:name="Grid Table 6 Colorful Accent 6" w:uiPriority="51"/>
-    <w:lsdException w:name="Grid Table 7 Colorful Accent 6" w:uiPriority="52"/>
-    <w:lsdException w:name="List Table 1 Light" w:uiPriority="46"/>
-    <w:lsdException w:name="List Table 2" w:uiPriority="47"/>
-    <w:lsdException w:name="List Table 3" w:uiPriority="48"/>
-    <w:lsdException w:name="List Table 4" w:uiPriority="49"/>
-    <w:lsdException w:name="List Table 5 Dark" w:uiPriority="50"/>
-    <w:lsdException w:name="List Table 6 Colorful" w:uiPriority="51"/>
-    <w:lsdException w:name="List Table 7 Colorful" w:uiPriority="52"/>
-    <w:lsdException w:name="List Table 1 Light Accent 1" w:uiPriority="46"/>
-    <w:lsdException w:name="List Table 2 Accent 1" w:uiPriority="47"/>
-    <w:lsdException w:name="List Table 3 Accent 1" w:uiPriority="48"/>
-    <w:lsdException w:name="List Table 4 Accent 1" w:uiPriority="49"/>
-    <w:lsdException w:name="List Table 5 Dark Accent 1" w:uiPriority="50"/>
-    <w:lsdException w:name="List Table 6 Colorful Accent 1" w:uiPriority="51"/>
-    <w:lsdException w:name="List Table 7 Colorful Accent 1" w:uiPriority="52"/>
-    <w:lsdException w:name="List Table 1 Light Accent 2" w:uiPriority="46"/>
-    <w:lsdException w:name="List Table 2 Accent 2" w:uiPriority="47"/>
-    <w:lsdException w:name="List Table 3 Accent 2" w:uiPriority="48"/>
-    <w:lsdException w:name="List Table 4 Accent 2" w:uiPriority="49"/>
-    <w:lsdException w:name="List Table 5 Dark Accent 2" w:uiPriority="50"/>
-    <w:lsdException w:name="List Table 6 Colorful Accent 2" w:uiPriority="51"/>
-    <w:lsdException w:name="List Table 7 Colorful Accent 2" w:uiPriority="52"/>
-    <w:lsdException w:name="List Table 1 Light Accent 3" w:uiPriority="46"/>
-    <w:lsdException w:name="List Table 2 Accent 3" w:uiPriority="47"/>
-    <w:lsdException w:name="List Table 3 Accent 3" w:uiPriority="48"/>
-    <w:lsdException w:name="List Table 4 Accent 3" w:uiPriority="49"/>
-    <w:lsdException w:name="List Table 5 Dark Accent 3" w:uiPriority="50"/>
-    <w:lsdException w:name="List Table 6 Colorful Accent 3" w:uiPriority="51"/>
-    <w:lsdException w:name="List Table 7 Colorful Accent 3" w:uiPriority="52"/>
-    <w:lsdException w:name="List Table 1 Light Accent 4" w:uiPriority="46"/>
-    <w:lsdException w:name="List Table 2 Accent 4" w:uiPriority="47"/>
-    <w:lsdException w:name="List Table 3 Accent 4" w:uiPriority="48"/>
-    <w:lsdException w:name="List Table 4 Accent 4" w:uiPriority="49"/>
-    <w:lsdException w:name="List Table 5 Dark Accent 4" w:uiPriority="50"/>
-    <w:lsdException w:name="List Table 6 Colorful Accent 4" w:uiPriority="51"/>
-    <w:lsdException w:name="List Table 7 Colorful Accent 4" w:uiPriority="52"/>
-    <w:lsdException w:name="List Table 1 Light Accent 5" w:uiPriority="46"/>
-    <w:lsdException w:name="List Table 2 Accent 5" w:uiPriority="47"/>
-    <w:lsdException w:name="List Table 3 Accent 5" w:uiPriority="48"/>
-    <w:lsdException w:name="List Table 4 Accent 5" w:uiPriority="49"/>
-    <w:lsdException w:name="List Table 5 Dark Accent 5" w:uiPriority="50"/>
-    <w:lsdException w:name="List Table 6 Colorful Accent 5" w:uiPriority="51"/>
-    <w:lsdException w:name="List Table 7 Colorful Accent 5" w:uiPriority="52"/>
-    <w:lsdException w:name="List Table 1 Light Accent 6" w:uiPriority="46"/>
-    <w:lsdException w:name="List Table 2 Accent 6" w:uiPriority="47"/>
-    <w:lsdException w:name="List Table 3 Accent 6" w:uiPriority="48"/>
-    <w:lsdException w:name="List Table 4 Accent 6" w:uiPriority="49"/>
-    <w:lsdException w:name="List Table 5 Dark Accent 6" w:uiPriority="50"/>
-    <w:lsdException w:name="List Table 6 Colorful Accent 6" w:uiPriority="51"/>
-    <w:lsdException w:name="List Table 7 Colorful Accent 6" w:uiPriority="52"/>
-    <w:lsdException w:name="Mention" w:semiHidden="1" w:uiPriority="99" w:unhideWhenUsed="1"/>
-    <w:lsdException w:name="Smart Hyperlink" w:semiHidden="1" w:uiPriority="99" w:unhideWhenUsed="1"/>
-    <w:lsdException w:name="Hashtag" w:semiHidden="1" w:uiPriority="99" w:unhideWhenUsed="1"/>
-    <w:lsdException w:name="Unresolved Mention" w:semiHidden="1" w:uiPriority="99" w:unhideWhenUsed="1"/>
-    <w:lsdException w:name="Smart Link" w:semiHidden="1" w:uiPriority="99" w:unhideWhenUsed="1"/>
-  </w:latentStyles>
+  <w:latentStyles w:count="276" w:defLockedState="0" w:defQFormat="0" w:defSemiHidden="0" w:defUIPriority="0" w:defUnhideWhenUsed="0"/>
   <w:style w:default="1" w:styleId="Normal" w:type="paragraph">
     <w:name w:val="Normal"/>
     <w:qFormat/>
+  </w:style>
+  <w:style w:styleId="BodyText" w:type="paragraph">
+    <w:name w:val="Body Text"/>
+    <w:basedOn w:val="Normal"/>
+    <w:link w:val="BodyTextChar"/>
+    <w:qFormat/>
+    <w:pPr>
+      <w:spacing w:after="180" w:before="180"/>
+    </w:pPr>
+  </w:style>
+  <w:style w:customStyle="1" w:styleId="FirstParagraph" w:type="paragraph">
+    <w:name w:val="First Paragraph"/>
+    <w:basedOn w:val="BodyText"/>
+    <w:next w:val="BodyText"/>
+    <w:qFormat/>
+  </w:style>
+  <w:style w:customStyle="1" w:styleId="Compact" w:type="paragraph">
+    <w:name w:val="Compact"/>
+    <w:basedOn w:val="BodyText"/>
+    <w:qFormat/>
+    <w:pPr>
+      <w:spacing w:after="36" w:before="36"/>
+    </w:pPr>
+  </w:style>
+  <w:style w:styleId="Title" w:type="paragraph">
+    <w:name w:val="Title"/>
+    <w:basedOn w:val="Normal"/>
+    <w:next w:val="BodyText"/>
+    <w:link w:val="TitleChar"/>
+    <w:uiPriority w:val="10"/>
+    <w:qFormat/>
+    <w:rsid w:val="00A10FD9"/>
+    <w:pPr>
+      <w:spacing w:after="80" w:line="240" w:lineRule="auto"/>
+      <w:contextualSpacing/>
+      <w:jc w:val="center"/>
+    </w:pPr>
+    <w:rPr>
+      <w:rFonts w:asciiTheme="majorHAnsi" w:cstheme="majorBidi" w:eastAsiaTheme="majorEastAsia" w:hAnsiTheme="majorHAnsi"/>
+      <w:sz w:val="56"/>
+      <w:szCs w:val="56"/>
+    </w:rPr>
+  </w:style>
+  <w:style w:customStyle="1" w:styleId="TitleChar" w:type="character">
+    <w:name w:val="Title Char"/>
+    <w:basedOn w:val="DefaultParagraphFont"/>
+    <w:link w:val="Title"/>
+    <w:uiPriority w:val="10"/>
+    <w:rsid w:val="00A10FD9"/>
+    <w:rPr>
+      <w:rFonts w:asciiTheme="majorHAnsi" w:cstheme="majorBidi" w:eastAsiaTheme="majorEastAsia" w:hAnsiTheme="majorHAnsi"/>
+      <w:sz w:val="56"/>
+      <w:szCs w:val="56"/>
+    </w:rPr>
+  </w:style>
+  <w:style w:styleId="Subtitle" w:type="paragraph">
+    <w:name w:val="Subtitle"/>
+    <w:basedOn w:val="Title"/>
+    <w:next w:val="BodyText"/>
+    <w:link w:val="SubtitleChar"/>
+    <w:uiPriority w:val="11"/>
+    <w:qFormat/>
+    <w:rsid w:val="00A10FD9"/>
+    <w:pPr>
+      <w:numPr>
+        <w:ilvl w:val="1"/>
+      </w:numPr>
+    </w:pPr>
+    <w:rPr>
+      <w:rFonts w:cstheme="majorBidi" w:eastAsiaTheme="majorEastAsia"/>
+      <w:spacing w:val="15"/>
+      <w:sz w:val="28"/>
+      <w:szCs w:val="28"/>
+    </w:rPr>
+  </w:style>
+  <w:style w:customStyle="1" w:styleId="SubtitleChar" w:type="character">
+    <w:name w:val="Subtitle Char"/>
+    <w:basedOn w:val="DefaultParagraphFont"/>
+    <w:link w:val="Subtitle"/>
+    <w:uiPriority w:val="11"/>
+    <w:rsid w:val="00A10FD9"/>
+    <w:rPr>
+      <w:rFonts w:cstheme="majorBidi" w:eastAsiaTheme="majorEastAsia"/>
+      <w:color w:themeColor="text1" w:themeTint="A6" w:val="595959"/>
+      <w:spacing w:val="15"/>
+      <w:sz w:val="28"/>
+      <w:szCs w:val="28"/>
+    </w:rPr>
+  </w:style>
+  <w:style w:customStyle="1" w:styleId="Author" w:type="paragraph">
+    <w:name w:val="Author"/>
+    <w:basedOn w:val="Title"/>
+    <w:next w:val="BodyText"/>
+    <w:qFormat/>
+    <w:pPr>
+      <w:keepNext/>
+      <w:keepLines/>
+    </w:pPr>
+    <w:rPr>
+      <w:sz w:val="24"/>
+      <w:szCs w:val="24"/>
+    </w:rPr>
+  </w:style>
+  <w:style w:styleId="Date" w:type="paragraph">
+    <w:name w:val="Date"/>
+    <w:basedOn w:val="Title"/>
+    <w:next w:val="BodyText"/>
+    <w:qFormat/>
+    <w:pPr>
+      <w:keepNext/>
+      <w:keepLines/>
+    </w:pPr>
+    <w:rPr>
+      <w:sz w:val="24"/>
+      <w:szCs w:val="24"/>
+    </w:rPr>
+  </w:style>
+  <w:style w:customStyle="1" w:styleId="AbstractTitle" w:type="paragraph">
+    <w:name w:val="Abstract Title"/>
+    <w:basedOn w:val="Normal"/>
+    <w:next w:val="Abstract"/>
+    <w:qFormat/>
+    <w:pPr>
+      <w:keepNext/>
+      <w:keepLines/>
+      <w:spacing w:after="0" w:before="300"/>
+      <w:jc w:val="center"/>
+    </w:pPr>
+    <w:rPr>
+      <w:b/>
+      <w:sz w:val="20"/>
+      <w:szCs w:val="20"/>
+    </w:rPr>
+  </w:style>
+  <w:style w:customStyle="1" w:styleId="Abstract" w:type="paragraph">
+    <w:name w:val="Abstract"/>
+    <w:basedOn w:val="Normal"/>
+    <w:next w:val="BodyText"/>
+    <w:qFormat/>
+    <w:pPr>
+      <w:keepNext/>
+      <w:keepLines/>
+      <w:spacing w:after="300" w:before="100"/>
+    </w:pPr>
+    <w:rPr>
+      <w:sz w:val="20"/>
+      <w:szCs w:val="20"/>
+    </w:rPr>
+  </w:style>
+  <w:style w:styleId="Bibliography" w:type="paragraph">
+    <w:name w:val="Bibliography"/>
+    <w:basedOn w:val="Normal"/>
+    <w:next w:val="Bibliography"/>
+    <w:qFormat/>
+    <w:pPr/>
+    <w:rPr/>
   </w:style>
   <w:style w:styleId="Heading1" w:type="paragraph">
     <w:name w:val="heading 1"/>
@@ -8192,184 +8170,6 @@
       <w:color w:themeColor="text1" w:themeTint="D8" w:val="272727"/>
     </w:rPr>
   </w:style>
-  <w:style w:default="1" w:styleId="DefaultParagraphFont" w:type="character">
-    <w:name w:val="Default Paragraph Font"/>
-    <w:uiPriority w:val="1"/>
-    <w:semiHidden/>
-    <w:unhideWhenUsed/>
-  </w:style>
-  <w:style w:default="1" w:styleId="TableNormal" w:type="table">
-    <w:name w:val="Normal Table"/>
-    <w:uiPriority w:val="99"/>
-    <w:semiHidden/>
-    <w:unhideWhenUsed/>
-    <w:tblPr>
-      <w:tblInd w:type="dxa" w:w="0"/>
-      <w:tblCellMar>
-        <w:top w:type="dxa" w:w="0"/>
-        <w:left w:type="dxa" w:w="108"/>
-        <w:bottom w:type="dxa" w:w="0"/>
-        <w:right w:type="dxa" w:w="108"/>
-      </w:tblCellMar>
-    </w:tblPr>
-  </w:style>
-  <w:style w:default="1" w:styleId="NoList" w:type="numbering">
-    <w:name w:val="No List"/>
-    <w:uiPriority w:val="99"/>
-    <w:semiHidden/>
-    <w:unhideWhenUsed/>
-  </w:style>
-  <w:style w:styleId="BodyText" w:type="paragraph">
-    <w:name w:val="Body Text"/>
-    <w:basedOn w:val="Normal"/>
-    <w:qFormat/>
-    <w:pPr>
-      <w:spacing w:after="180" w:before="180"/>
-    </w:pPr>
-  </w:style>
-  <w:style w:customStyle="1" w:styleId="FirstParagraph" w:type="paragraph">
-    <w:name w:val="First Paragraph"/>
-    <w:basedOn w:val="BodyText"/>
-    <w:next w:val="BodyText"/>
-    <w:qFormat/>
-  </w:style>
-  <w:style w:customStyle="1" w:styleId="Compact" w:type="paragraph">
-    <w:name w:val="Compact"/>
-    <w:basedOn w:val="BodyText"/>
-    <w:qFormat/>
-    <w:pPr>
-      <w:spacing w:after="36" w:before="36"/>
-    </w:pPr>
-  </w:style>
-  <w:style w:styleId="Title" w:type="paragraph">
-    <w:name w:val="Title"/>
-    <w:basedOn w:val="Normal"/>
-    <w:next w:val="BodyText"/>
-    <w:link w:val="TitleChar"/>
-    <w:uiPriority w:val="10"/>
-    <w:qFormat/>
-    <w:rsid w:val="00A10FD9"/>
-    <w:pPr>
-      <w:spacing w:after="80"/>
-      <w:contextualSpacing/>
-      <w:jc w:val="center"/>
-    </w:pPr>
-    <w:rPr>
-      <w:rFonts w:asciiTheme="majorHAnsi" w:cstheme="majorBidi" w:eastAsiaTheme="majorEastAsia" w:hAnsiTheme="majorHAnsi"/>
-      <w:sz w:val="56"/>
-      <w:szCs w:val="56"/>
-    </w:rPr>
-  </w:style>
-  <w:style w:customStyle="1" w:styleId="TitleChar" w:type="character">
-    <w:name w:val="Title Char"/>
-    <w:basedOn w:val="DefaultParagraphFont"/>
-    <w:link w:val="Title"/>
-    <w:uiPriority w:val="10"/>
-    <w:rsid w:val="00A10FD9"/>
-    <w:rPr>
-      <w:rFonts w:asciiTheme="majorHAnsi" w:cstheme="majorBidi" w:eastAsiaTheme="majorEastAsia" w:hAnsiTheme="majorHAnsi"/>
-      <w:sz w:val="56"/>
-      <w:szCs w:val="56"/>
-    </w:rPr>
-  </w:style>
-  <w:style w:styleId="Subtitle" w:type="paragraph">
-    <w:name w:val="Subtitle"/>
-    <w:basedOn w:val="Title"/>
-    <w:next w:val="BodyText"/>
-    <w:link w:val="SubtitleChar"/>
-    <w:uiPriority w:val="11"/>
-    <w:qFormat/>
-    <w:rsid w:val="00A10FD9"/>
-    <w:pPr>
-      <w:numPr>
-        <w:ilvl w:val="1"/>
-      </w:numPr>
-    </w:pPr>
-    <w:rPr>
-      <w:spacing w:val="15"/>
-      <w:sz w:val="28"/>
-      <w:szCs w:val="28"/>
-    </w:rPr>
-  </w:style>
-  <w:style w:customStyle="1" w:styleId="SubtitleChar" w:type="character">
-    <w:name w:val="Subtitle Char"/>
-    <w:basedOn w:val="DefaultParagraphFont"/>
-    <w:link w:val="Subtitle"/>
-    <w:uiPriority w:val="11"/>
-    <w:rsid w:val="00A10FD9"/>
-    <w:rPr>
-      <w:rFonts w:cstheme="majorBidi" w:eastAsiaTheme="majorEastAsia"/>
-      <w:color w:themeColor="text1" w:themeTint="A6" w:val="595959"/>
-      <w:spacing w:val="15"/>
-      <w:sz w:val="28"/>
-      <w:szCs w:val="28"/>
-    </w:rPr>
-  </w:style>
-  <w:style w:customStyle="1" w:styleId="Author" w:type="paragraph">
-    <w:name w:val="Author"/>
-    <w:basedOn w:val="Title"/>
-    <w:next w:val="BodyText"/>
-    <w:qFormat/>
-    <w:pPr>
-      <w:keepNext/>
-      <w:keepLines/>
-    </w:pPr>
-    <w:rPr>
-      <w:sz w:val="24"/>
-      <w:szCs w:val="24"/>
-    </w:rPr>
-  </w:style>
-  <w:style w:styleId="Date" w:type="paragraph">
-    <w:name w:val="Date"/>
-    <w:basedOn w:val="Title"/>
-    <w:next w:val="BodyText"/>
-    <w:qFormat/>
-    <w:pPr>
-      <w:keepNext/>
-      <w:keepLines/>
-    </w:pPr>
-    <w:rPr>
-      <w:sz w:val="24"/>
-      <w:szCs w:val="24"/>
-    </w:rPr>
-  </w:style>
-  <w:style w:customStyle="1" w:styleId="AbstractTitle" w:type="paragraph">
-    <w:name w:val="Abstract Title"/>
-    <w:basedOn w:val="Normal"/>
-    <w:next w:val="Abstract"/>
-    <w:qFormat/>
-    <w:pPr>
-      <w:keepNext/>
-      <w:keepLines/>
-      <w:spacing w:after="0" w:before="300"/>
-      <w:jc w:val="center"/>
-    </w:pPr>
-    <w:rPr>
-      <w:b/>
-      <w:sz w:val="20"/>
-      <w:szCs w:val="20"/>
-    </w:rPr>
-  </w:style>
-  <w:style w:customStyle="1" w:styleId="Abstract" w:type="paragraph">
-    <w:name w:val="Abstract"/>
-    <w:basedOn w:val="Normal"/>
-    <w:next w:val="BodyText"/>
-    <w:qFormat/>
-    <w:pPr>
-      <w:keepNext/>
-      <w:keepLines/>
-      <w:spacing w:after="300" w:before="100"/>
-    </w:pPr>
-    <w:rPr>
-      <w:sz w:val="20"/>
-      <w:szCs w:val="20"/>
-    </w:rPr>
-  </w:style>
-  <w:style w:styleId="Bibliography" w:type="paragraph">
-    <w:name w:val="Bibliography"/>
-    <w:basedOn w:val="Normal"/>
-    <w:qFormat/>
-  </w:style>
   <w:style w:customStyle="1" w:styleId="Heading1Char" w:type="character">
     <w:name w:val="Heading 1 Char"/>
     <w:basedOn w:val="DefaultParagraphFont"/>
@@ -8498,17 +8298,18 @@
     <w:qFormat/>
     <w:pPr>
       <w:spacing w:after="100" w:before="100"/>
-      <w:ind w:left="480" w:right="480"/>
+      <w:ind w:firstLine="0" w:left="480" w:right="480"/>
     </w:pPr>
   </w:style>
   <w:style w:styleId="FootnoteText" w:type="paragraph">
-    <w:name w:val="footnote text"/>
+    <w:name w:val="Footnote Text"/>
     <w:basedOn w:val="Normal"/>
+    <w:next w:val="FootnoteText"/>
     <w:uiPriority w:val="9"/>
     <w:unhideWhenUsed/>
     <w:qFormat/>
   </w:style>
-  <w:style w:customStyle="1" w:styleId="FootnoteBlockText" w:type="paragraph">
+  <w:style w:styleId="FootnoteBlockText" w:type="paragraph">
     <w:name w:val="Footnote Block Text"/>
     <w:basedOn w:val="FootnoteText"/>
     <w:next w:val="FootnoteText"/>
@@ -8517,11 +8318,17 @@
     <w:qFormat/>
     <w:pPr>
       <w:spacing w:after="100" w:before="100"/>
-      <w:ind w:left="480" w:right="480"/>
+      <w:ind w:firstLine="0" w:left="480" w:right="480"/>
     </w:pPr>
   </w:style>
-  <w:style w:customStyle="1" w:styleId="Table" w:type="table">
+  <w:style w:default="1" w:styleId="DefaultParagraphFont" w:type="character">
+    <w:name w:val="Default Paragraph Font"/>
+    <w:semiHidden/>
+    <w:unhideWhenUsed/>
+  </w:style>
+  <w:style w:default="1" w:styleId="Table" w:type="table">
     <w:name w:val="Table"/>
+    <w:basedOn w:val="TableNormal"/>
     <w:semiHidden/>
     <w:unhideWhenUsed/>
     <w:qFormat/>
@@ -8535,10 +8342,9 @@
       </w:tblCellMar>
     </w:tblPr>
     <w:tblStylePr w:type="firstRow">
-      <w:tblPr/>
       <w:tcPr>
         <w:tcBorders>
-          <w:bottom w:color="auto" w:space="0" w:sz="0" w:val="single"/>
+          <w:bottom w:val="single"/>
         </w:tcBorders>
         <w:vAlign w:val="bottom"/>
       </w:tcPr>
@@ -8562,11 +8368,11 @@
     <w:basedOn w:val="Normal"/>
   </w:style>
   <w:style w:styleId="Caption" w:type="paragraph">
-    <w:name w:val="caption"/>
+    <w:name w:val="Caption"/>
     <w:basedOn w:val="Normal"/>
-    <w:link w:val="CaptionChar"/>
+    <w:link w:val="BodyTextChar"/>
     <w:pPr>
-      <w:spacing w:after="120"/>
+      <w:spacing w:after="120" w:before="0"/>
     </w:pPr>
     <w:rPr>
       <w:i/>
@@ -8594,15 +8400,14 @@
       <w:keepNext/>
     </w:pPr>
   </w:style>
-  <w:style w:customStyle="1" w:styleId="CaptionChar" w:type="character">
-    <w:name w:val="Caption Char"/>
+  <w:style w:customStyle="1" w:styleId="BodyTextChar" w:type="character">
+    <w:name w:val="Body Text Char"/>
     <w:basedOn w:val="DefaultParagraphFont"/>
-    <w:link w:val="Caption"/>
+    <w:link w:val="BodyText"/>
   </w:style>
   <w:style w:customStyle="1" w:styleId="VerbatimChar" w:type="character">
     <w:name w:val="Verbatim Char"/>
-    <w:basedOn w:val="CaptionChar"/>
-    <w:link w:val="SourceCode"/>
+    <w:basedOn w:val="BodyTextChar"/>
     <w:rPr>
       <w:rFonts w:ascii="Consolas" w:hAnsi="Consolas"/>
       <w:sz w:val="22"/>
@@ -8610,20 +8415,20 @@
   </w:style>
   <w:style w:customStyle="1" w:styleId="SectionNumber" w:type="character">
     <w:name w:val="Section Number"/>
-    <w:basedOn w:val="CaptionChar"/>
+    <w:basedOn w:val="BodyTextChar"/>
   </w:style>
   <w:style w:styleId="FootnoteReference" w:type="character">
-    <w:name w:val="footnote reference"/>
-    <w:basedOn w:val="CaptionChar"/>
+    <w:name w:val="Footnote Reference"/>
+    <w:basedOn w:val="BodyTextChar"/>
     <w:rPr>
       <w:vertAlign w:val="superscript"/>
     </w:rPr>
   </w:style>
   <w:style w:styleId="Hyperlink" w:type="character">
     <w:name w:val="Hyperlink"/>
-    <w:basedOn w:val="CaptionChar"/>
+    <w:basedOn w:val="BodyTextChar"/>
     <w:rPr>
-      <w:color w:themeColor="accent1" w:val="156082"/>
+      <w:color w:themeColor="accent1" w:val="4F81BD"/>
     </w:rPr>
   </w:style>
   <w:style w:styleId="TOCHeading" w:type="paragraph">
@@ -8637,310 +8442,246 @@
       <w:spacing w:before="240" w:line="259" w:lineRule="auto"/>
       <w:outlineLvl w:val="9"/>
     </w:pPr>
+    <w:rPr>
+      <w:rFonts w:asciiTheme="majorHAnsi" w:cstheme="majorBidi" w:eastAsiaTheme="majorEastAsia" w:hAnsiTheme="majorHAnsi"/>
+      <w:b w:val="0"/>
+      <w:bCs w:val="0"/>
+      <w:color w:themeColor="accent1" w:themeShade="BF" w:val="365F91"/>
+    </w:rPr>
   </w:style>
-  <w:style w:customStyle="1" w:styleId="SourceCode" w:type="paragraph">
+  <w:style w:type="paragraph" w:customStyle="1" w:styleId="SourceCode">
     <w:name w:val="Source Code"/>
     <w:basedOn w:val="Normal"/>
     <w:link w:val="VerbatimChar"/>
     <w:pPr>
-      <w:wordWrap w:val="0"/>
+      <w:wordWrap w:val="off"/>
     </w:pPr>
   </w:style>
-  <w:style w:customStyle="1" w:styleId="KeywordTok" w:type="character">
+  <w:style w:type="character" w:customStyle="1" w:styleId="KeywordTok">
     <w:name w:val="KeywordTok"/>
     <w:basedOn w:val="VerbatimChar"/>
     <w:rPr>
-      <w:rFonts w:ascii="Consolas" w:hAnsi="Consolas"/>
       <w:b/>
       <w:color w:val="007020"/>
-      <w:sz w:val="22"/>
     </w:rPr>
   </w:style>
-  <w:style w:customStyle="1" w:styleId="DataTypeTok" w:type="character">
+  <w:style w:type="character" w:customStyle="1" w:styleId="DataTypeTok">
     <w:name w:val="DataTypeTok"/>
     <w:basedOn w:val="VerbatimChar"/>
     <w:rPr>
-      <w:rFonts w:ascii="Consolas" w:hAnsi="Consolas"/>
       <w:color w:val="902000"/>
-      <w:sz w:val="22"/>
     </w:rPr>
   </w:style>
-  <w:style w:customStyle="1" w:styleId="DecValTok" w:type="character">
+  <w:style w:type="character" w:customStyle="1" w:styleId="DecValTok">
     <w:name w:val="DecValTok"/>
     <w:basedOn w:val="VerbatimChar"/>
     <w:rPr>
-      <w:rFonts w:ascii="Consolas" w:hAnsi="Consolas"/>
-      <w:color w:val="40A070"/>
-      <w:sz w:val="22"/>
+      <w:color w:val="40a070"/>
     </w:rPr>
   </w:style>
-  <w:style w:customStyle="1" w:styleId="BaseNTok" w:type="character">
+  <w:style w:type="character" w:customStyle="1" w:styleId="BaseNTok">
     <w:name w:val="BaseNTok"/>
     <w:basedOn w:val="VerbatimChar"/>
     <w:rPr>
-      <w:rFonts w:ascii="Consolas" w:hAnsi="Consolas"/>
-      <w:color w:val="40A070"/>
-      <w:sz w:val="22"/>
+      <w:color w:val="40a070"/>
     </w:rPr>
   </w:style>
-  <w:style w:customStyle="1" w:styleId="FloatTok" w:type="character">
+  <w:style w:type="character" w:customStyle="1" w:styleId="FloatTok">
     <w:name w:val="FloatTok"/>
     <w:basedOn w:val="VerbatimChar"/>
     <w:rPr>
-      <w:rFonts w:ascii="Consolas" w:hAnsi="Consolas"/>
-      <w:color w:val="40A070"/>
-      <w:sz w:val="22"/>
+      <w:color w:val="40a070"/>
     </w:rPr>
   </w:style>
-  <w:style w:customStyle="1" w:styleId="ConstantTok" w:type="character">
+  <w:style w:type="character" w:customStyle="1" w:styleId="ConstantTok">
     <w:name w:val="ConstantTok"/>
     <w:basedOn w:val="VerbatimChar"/>
     <w:rPr>
-      <w:rFonts w:ascii="Consolas" w:hAnsi="Consolas"/>
       <w:color w:val="880000"/>
-      <w:sz w:val="22"/>
     </w:rPr>
   </w:style>
-  <w:style w:customStyle="1" w:styleId="CharTok" w:type="character">
+  <w:style w:type="character" w:customStyle="1" w:styleId="CharTok">
     <w:name w:val="CharTok"/>
     <w:basedOn w:val="VerbatimChar"/>
     <w:rPr>
-      <w:rFonts w:ascii="Consolas" w:hAnsi="Consolas"/>
-      <w:color w:val="4070A0"/>
-      <w:sz w:val="22"/>
+      <w:color w:val="4070a0"/>
     </w:rPr>
   </w:style>
-  <w:style w:customStyle="1" w:styleId="SpecialCharTok" w:type="character">
+  <w:style w:type="character" w:customStyle="1" w:styleId="SpecialCharTok">
     <w:name w:val="SpecialCharTok"/>
     <w:basedOn w:val="VerbatimChar"/>
     <w:rPr>
-      <w:rFonts w:ascii="Consolas" w:hAnsi="Consolas"/>
-      <w:color w:val="4070A0"/>
-      <w:sz w:val="22"/>
+      <w:color w:val="4070a0"/>
     </w:rPr>
   </w:style>
-  <w:style w:customStyle="1" w:styleId="StringTok" w:type="character">
+  <w:style w:type="character" w:customStyle="1" w:styleId="StringTok">
     <w:name w:val="StringTok"/>
     <w:basedOn w:val="VerbatimChar"/>
     <w:rPr>
-      <w:rFonts w:ascii="Consolas" w:hAnsi="Consolas"/>
-      <w:color w:val="4070A0"/>
-      <w:sz w:val="22"/>
+      <w:color w:val="4070a0"/>
     </w:rPr>
   </w:style>
-  <w:style w:customStyle="1" w:styleId="VerbatimStringTok" w:type="character">
+  <w:style w:type="character" w:customStyle="1" w:styleId="VerbatimStringTok">
     <w:name w:val="VerbatimStringTok"/>
     <w:basedOn w:val="VerbatimChar"/>
     <w:rPr>
-      <w:rFonts w:ascii="Consolas" w:hAnsi="Consolas"/>
-      <w:color w:val="4070A0"/>
-      <w:sz w:val="22"/>
+      <w:color w:val="4070a0"/>
     </w:rPr>
   </w:style>
-  <w:style w:customStyle="1" w:styleId="SpecialStringTok" w:type="character">
+  <w:style w:type="character" w:customStyle="1" w:styleId="SpecialStringTok">
     <w:name w:val="SpecialStringTok"/>
     <w:basedOn w:val="VerbatimChar"/>
     <w:rPr>
-      <w:rFonts w:ascii="Consolas" w:hAnsi="Consolas"/>
-      <w:color w:val="BB6688"/>
-      <w:sz w:val="22"/>
+      <w:color w:val="bb6688"/>
     </w:rPr>
   </w:style>
-  <w:style w:customStyle="1" w:styleId="ImportTok" w:type="character">
+  <w:style w:type="character" w:customStyle="1" w:styleId="ImportTok">
     <w:name w:val="ImportTok"/>
     <w:basedOn w:val="VerbatimChar"/>
     <w:rPr>
-      <w:rFonts w:ascii="Consolas" w:hAnsi="Consolas"/>
       <w:b/>
       <w:color w:val="008000"/>
-      <w:sz w:val="22"/>
     </w:rPr>
   </w:style>
-  <w:style w:customStyle="1" w:styleId="CommentTok" w:type="character">
+  <w:style w:type="character" w:customStyle="1" w:styleId="CommentTok">
     <w:name w:val="CommentTok"/>
     <w:basedOn w:val="VerbatimChar"/>
     <w:rPr>
-      <w:rFonts w:ascii="Consolas" w:hAnsi="Consolas"/>
       <w:i/>
-      <w:color w:val="60A0B0"/>
-      <w:sz w:val="22"/>
+      <w:color w:val="60a0b0"/>
     </w:rPr>
   </w:style>
-  <w:style w:customStyle="1" w:styleId="DocumentationTok" w:type="character">
+  <w:style w:type="character" w:customStyle="1" w:styleId="DocumentationTok">
     <w:name w:val="DocumentationTok"/>
     <w:basedOn w:val="VerbatimChar"/>
     <w:rPr>
-      <w:rFonts w:ascii="Consolas" w:hAnsi="Consolas"/>
       <w:i/>
-      <w:color w:val="BA2121"/>
-      <w:sz w:val="22"/>
+      <w:color w:val="ba2121"/>
     </w:rPr>
   </w:style>
-  <w:style w:customStyle="1" w:styleId="AnnotationTok" w:type="character">
+  <w:style w:type="character" w:customStyle="1" w:styleId="AnnotationTok">
     <w:name w:val="AnnotationTok"/>
     <w:basedOn w:val="VerbatimChar"/>
     <w:rPr>
-      <w:rFonts w:ascii="Consolas" w:hAnsi="Consolas"/>
       <w:b/>
       <w:i/>
-      <w:color w:val="60A0B0"/>
-      <w:sz w:val="22"/>
+      <w:color w:val="60a0b0"/>
     </w:rPr>
   </w:style>
-  <w:style w:customStyle="1" w:styleId="CommentVarTok" w:type="character">
+  <w:style w:type="character" w:customStyle="1" w:styleId="CommentVarTok">
     <w:name w:val="CommentVarTok"/>
     <w:basedOn w:val="VerbatimChar"/>
     <w:rPr>
-      <w:rFonts w:ascii="Consolas" w:hAnsi="Consolas"/>
       <w:b/>
       <w:i/>
-      <w:color w:val="60A0B0"/>
-      <w:sz w:val="22"/>
+      <w:color w:val="60a0b0"/>
     </w:rPr>
   </w:style>
-  <w:style w:customStyle="1" w:styleId="OtherTok" w:type="character">
+  <w:style w:type="character" w:customStyle="1" w:styleId="OtherTok">
     <w:name w:val="OtherTok"/>
     <w:basedOn w:val="VerbatimChar"/>
     <w:rPr>
-      <w:rFonts w:ascii="Consolas" w:hAnsi="Consolas"/>
       <w:color w:val="007020"/>
-      <w:sz w:val="22"/>
     </w:rPr>
   </w:style>
-  <w:style w:customStyle="1" w:styleId="FunctionTok" w:type="character">
+  <w:style w:type="character" w:customStyle="1" w:styleId="FunctionTok">
     <w:name w:val="FunctionTok"/>
     <w:basedOn w:val="VerbatimChar"/>
     <w:rPr>
-      <w:rFonts w:ascii="Consolas" w:hAnsi="Consolas"/>
-      <w:color w:val="06287E"/>
-      <w:sz w:val="22"/>
+      <w:color w:val="06287e"/>
     </w:rPr>
   </w:style>
-  <w:style w:customStyle="1" w:styleId="VariableTok" w:type="character">
+  <w:style w:type="character" w:customStyle="1" w:styleId="VariableTok">
     <w:name w:val="VariableTok"/>
     <w:basedOn w:val="VerbatimChar"/>
     <w:rPr>
-      <w:rFonts w:ascii="Consolas" w:hAnsi="Consolas"/>
-      <w:color w:val="19177C"/>
-      <w:sz w:val="22"/>
+      <w:color w:val="19177c"/>
     </w:rPr>
   </w:style>
-  <w:style w:customStyle="1" w:styleId="ControlFlowTok" w:type="character">
+  <w:style w:type="character" w:customStyle="1" w:styleId="ControlFlowTok">
     <w:name w:val="ControlFlowTok"/>
     <w:basedOn w:val="VerbatimChar"/>
     <w:rPr>
-      <w:rFonts w:ascii="Consolas" w:hAnsi="Consolas"/>
       <w:b/>
       <w:color w:val="007020"/>
-      <w:sz w:val="22"/>
     </w:rPr>
   </w:style>
-  <w:style w:customStyle="1" w:styleId="OperatorTok" w:type="character">
+  <w:style w:type="character" w:customStyle="1" w:styleId="OperatorTok">
     <w:name w:val="OperatorTok"/>
     <w:basedOn w:val="VerbatimChar"/>
     <w:rPr>
-      <w:rFonts w:ascii="Consolas" w:hAnsi="Consolas"/>
       <w:color w:val="666666"/>
-      <w:sz w:val="22"/>
     </w:rPr>
   </w:style>
-  <w:style w:customStyle="1" w:styleId="BuiltInTok" w:type="character">
+  <w:style w:type="character" w:customStyle="1" w:styleId="BuiltInTok">
     <w:name w:val="BuiltInTok"/>
     <w:basedOn w:val="VerbatimChar"/>
     <w:rPr>
-      <w:rFonts w:ascii="Consolas" w:hAnsi="Consolas"/>
       <w:color w:val="008000"/>
-      <w:sz w:val="22"/>
     </w:rPr>
   </w:style>
-  <w:style w:customStyle="1" w:styleId="ExtensionTok" w:type="character">
+  <w:style w:type="character" w:customStyle="1" w:styleId="ExtensionTok">
     <w:name w:val="ExtensionTok"/>
     <w:basedOn w:val="VerbatimChar"/>
-    <w:rPr>
-      <w:rFonts w:ascii="Consolas" w:hAnsi="Consolas"/>
-      <w:sz w:val="22"/>
-    </w:rPr>
+    <w:rPr/>
   </w:style>
-  <w:style w:customStyle="1" w:styleId="PreprocessorTok" w:type="character">
+  <w:style w:type="character" w:customStyle="1" w:styleId="PreprocessorTok">
     <w:name w:val="PreprocessorTok"/>
     <w:basedOn w:val="VerbatimChar"/>
     <w:rPr>
-      <w:rFonts w:ascii="Consolas" w:hAnsi="Consolas"/>
-      <w:color w:val="BC7A00"/>
-      <w:sz w:val="22"/>
+      <w:color w:val="bc7a00"/>
     </w:rPr>
   </w:style>
-  <w:style w:customStyle="1" w:styleId="AttributeTok" w:type="character">
+  <w:style w:type="character" w:customStyle="1" w:styleId="AttributeTok">
     <w:name w:val="AttributeTok"/>
     <w:basedOn w:val="VerbatimChar"/>
     <w:rPr>
-      <w:rFonts w:ascii="Consolas" w:hAnsi="Consolas"/>
-      <w:color w:val="7D9029"/>
-      <w:sz w:val="22"/>
+      <w:color w:val="7d9029"/>
     </w:rPr>
   </w:style>
-  <w:style w:customStyle="1" w:styleId="RegionMarkerTok" w:type="character">
+  <w:style w:type="character" w:customStyle="1" w:styleId="RegionMarkerTok">
     <w:name w:val="RegionMarkerTok"/>
     <w:basedOn w:val="VerbatimChar"/>
-    <w:rPr>
-      <w:rFonts w:ascii="Consolas" w:hAnsi="Consolas"/>
-      <w:sz w:val="22"/>
-    </w:rPr>
+    <w:rPr/>
   </w:style>
-  <w:style w:customStyle="1" w:styleId="InformationTok" w:type="character">
+  <w:style w:type="character" w:customStyle="1" w:styleId="InformationTok">
     <w:name w:val="InformationTok"/>
     <w:basedOn w:val="VerbatimChar"/>
     <w:rPr>
-      <w:rFonts w:ascii="Consolas" w:hAnsi="Consolas"/>
       <w:b/>
       <w:i/>
-      <w:color w:val="60A0B0"/>
-      <w:sz w:val="22"/>
+      <w:color w:val="60a0b0"/>
     </w:rPr>
   </w:style>
-  <w:style w:customStyle="1" w:styleId="WarningTok" w:type="character">
+  <w:style w:type="character" w:customStyle="1" w:styleId="WarningTok">
     <w:name w:val="WarningTok"/>
     <w:basedOn w:val="VerbatimChar"/>
     <w:rPr>
-      <w:rFonts w:ascii="Consolas" w:hAnsi="Consolas"/>
       <w:b/>
       <w:i/>
-      <w:color w:val="60A0B0"/>
-      <w:sz w:val="22"/>
+      <w:color w:val="60a0b0"/>
     </w:rPr>
   </w:style>
-  <w:style w:customStyle="1" w:styleId="AlertTok" w:type="character">
+  <w:style w:type="character" w:customStyle="1" w:styleId="AlertTok">
     <w:name w:val="AlertTok"/>
     <w:basedOn w:val="VerbatimChar"/>
     <w:rPr>
-      <w:rFonts w:ascii="Consolas" w:hAnsi="Consolas"/>
       <w:b/>
-      <w:color w:val="FF0000"/>
-      <w:sz w:val="22"/>
+      <w:color w:val="ff0000"/>
     </w:rPr>
   </w:style>
-  <w:style w:customStyle="1" w:styleId="ErrorTok" w:type="character">
+  <w:style w:type="character" w:customStyle="1" w:styleId="ErrorTok">
     <w:name w:val="ErrorTok"/>
     <w:basedOn w:val="VerbatimChar"/>
     <w:rPr>
-      <w:rFonts w:ascii="Consolas" w:hAnsi="Consolas"/>
       <w:b/>
-      <w:color w:val="FF0000"/>
-      <w:sz w:val="22"/>
+      <w:color w:val="ff0000"/>
     </w:rPr>
   </w:style>
-  <w:style w:customStyle="1" w:styleId="NormalTok" w:type="character">
+  <w:style w:type="character" w:customStyle="1" w:styleId="NormalTok">
     <w:name w:val="NormalTok"/>
     <w:basedOn w:val="VerbatimChar"/>
-    <w:rPr>
-      <w:rFonts w:ascii="Consolas" w:hAnsi="Consolas"/>
-      <w:sz w:val="22"/>
-    </w:rPr>
-  </w:style>
-  <w:style w:styleId="LineNumber" w:type="character">
-    <w:name w:val="line number"/>
-    <w:basedOn w:val="DefaultParagraphFont"/>
-    <w:rsid w:val="00747E44"/>
+    <w:rPr/>
   </w:style>
 </w:styles>
 </file>

</xml_diff>